<commit_message>
docs: cierre del bloque 3 (Word 3.4, 3.5, 4.3, 4.4, 4.6; HAL-01 a HAL-05; ESTADO, CONTEXTO 11, BITÁCORA)
Co-Authored-By: Claude Opus 5.5 <noreply@anthropic.com>
Claude-Session: https://claude.ai/code/session_017At5jrBqssTLVLpHCxyjLn
</commit_message>
<xml_diff>
--- a/docs/entregas/Final_Secciones_3-4_3-5_4-3_4-4_4-6_DevSecOps.docx
+++ b/docs/entregas/Final_Secciones_3-4_3-5_4-3_4-4_4-6_DevSecOps.docx
@@ -79,7 +79,6 @@
         <w:tblW w:type="auto" w:w="0"/>
         <w:tblLayout w:type="fixed"/>
         <w:tblLook w:firstColumn="1" w:firstRow="1" w:lastColumn="0" w:lastRow="0" w:noHBand="0" w:noVBand="1" w:val="04A0"/>
-        <w:tblLayout w:type="fixed"/>
       </w:tblPr>
       <w:tblGrid>
         <w:gridCol w:w="2389"/>
@@ -710,7 +709,6 @@
         <w:tblW w:type="auto" w:w="0"/>
         <w:tblLayout w:type="fixed"/>
         <w:tblLook w:firstColumn="1" w:firstRow="1" w:lastColumn="0" w:lastRow="0" w:noHBand="0" w:noVBand="1" w:val="04A0"/>
-        <w:tblLayout w:type="fixed"/>
       </w:tblPr>
       <w:tblGrid>
         <w:gridCol w:w="4456"/>
@@ -1552,7 +1550,6 @@
         <w:tblW w:type="auto" w:w="0"/>
         <w:tblLayout w:type="fixed"/>
         <w:tblLook w:firstColumn="1" w:firstRow="1" w:lastColumn="0" w:lastRow="0" w:noHBand="0" w:noVBand="1" w:val="04A0"/>
-        <w:tblLayout w:type="fixed"/>
       </w:tblPr>
       <w:tblGrid>
         <w:gridCol w:w="2497"/>
@@ -2871,7 +2868,7 @@
         <w:rPr>
           <w:sz w:val="24"/>
         </w:rPr>
-        <w:t>npm audit cuenta paquetes afectados; en la app, los 7 paquetes de severidad alta vienen de 3 avisos distintos (Tabla 33). En las imágenes las cifras son por imagen (las cinco dan lo mismo) y la compuerta solo bloquea las altas o críticas que ya tienen corrección. La única media que queda es ca-certificates del sistema operativo base (Amazon Linux 2023), que se corrige cuando AWS publique la imagen nueva. Evidencias EVD-3-04 y EVD-3-05.</w:t>
+        <w:t>npm audit cuenta paquetes afectados; en la app, los 7 paquetes de severidad alta vienen de 3 avisos distintos (Tabla 33). En las imágenes las cifras son por imagen (las cinco dan lo mismo) y la compuerta solo bloquea las altas o críticas que ya tienen corrección. La única media que queda es ca-certificates del sistema operativo base (Amazon Linux 2023), que se corrige cuando AWS publique la imagen nueva. Trivy, como segunda opinión sobre las dependencias, coincide: 0 en los microservicios y 5 en la app (2 altas: decode-uri-component y node-forge, las mismas de HAL-02 y HAL-03). Evidencias EVD-3-04 y EVD-3-05.</w:t>
       </w:r>
     </w:p>
     <w:p>
@@ -2885,7 +2882,7 @@
           <w:i w:val="0"/>
           <w:sz w:val="24"/>
         </w:rPr>
-        <w:t>Todo hallazgo real se registró con un identificador HAL y su tratamiento (Tabla 33). El más relevante fue HAL-01: la versión de zod que habíamos fijado el 3 de octubre (4.6.5) quedó vulnerable el 1 de octubre, cuando se publicó el aviso GHSA-mrhx-c7xc-m3w5 (agotamiento de memoria al validar listas muy grandes). La subimos a 4.6.7 en la app y en los microservicios, y además todos nuestros esquemas limitan el tamaño del cuerpo y de las listas. Para demostrar que la compuerta funciona, abrimos un pull request de prueba (número 37) que volvía a poner zod 4.6.5 en los microservicios: la etapa SCA falló con ese aviso y el pull request quedó bloqueado (evidencia EVD-3-10).</w:t>
+        <w:t>Todo hallazgo real se registró con un identificador HAL y su tratamiento (Tabla 33). El más relevante fue HAL-01: la versión de zod que fijamos el 3 de octubre (4.6.5) está afectada por el aviso GHSA-mrhx-c7xc-m3w5 (agotamiento de memoria al validar listas muy grandes), publicado el 1 de octubre; no lo notamos al fijarla y apareció al correr npm audit para armar la compuerta. Es el caso que el análisis automático evita. La subimos a 4.6.7 en la app y en los microservicios, y además todos nuestros esquemas limitan el tamaño del cuerpo y de las listas. Para demostrar que la compuerta funciona, abrimos un pull request de prueba (número 37) que volvía a poner zod 4.6.5 en los microservicios: la etapa SCA falló con ese aviso y el pull request quedó bloqueado (evidencia EVD-3-10).</w:t>
       </w:r>
     </w:p>
     <w:p>
@@ -2919,7 +2916,6 @@
         <w:tblW w:type="auto" w:w="0"/>
         <w:tblLayout w:type="fixed"/>
         <w:tblLook w:firstColumn="1" w:firstRow="1" w:lastColumn="0" w:lastRow="0" w:noHBand="0" w:noVBand="1" w:val="04A0"/>
-        <w:tblLayout w:type="fixed"/>
       </w:tblPr>
       <w:tblGrid>
         <w:gridCol w:w="977"/>
@@ -3947,7 +3943,6 @@
         <w:tblW w:type="auto" w:w="0"/>
         <w:tblLayout w:type="fixed"/>
         <w:tblLook w:firstColumn="1" w:firstRow="1" w:lastColumn="0" w:lastRow="0" w:noHBand="0" w:noVBand="1" w:val="04A0"/>
-        <w:tblLayout w:type="fixed"/>
       </w:tblPr>
       <w:tblGrid>
         <w:gridCol w:w="1897"/>
@@ -5678,7 +5673,6 @@
         <w:tblW w:type="auto" w:w="0"/>
         <w:tblLayout w:type="fixed"/>
         <w:tblLook w:firstColumn="1" w:firstRow="1" w:lastColumn="0" w:lastRow="0" w:noHBand="0" w:noVBand="1" w:val="04A0"/>
-        <w:tblLayout w:type="fixed"/>
       </w:tblPr>
       <w:tblGrid>
         <w:gridCol w:w="1695"/>
@@ -6615,7 +6609,6 @@
         <w:tblW w:type="auto" w:w="0"/>
         <w:tblLayout w:type="fixed"/>
         <w:tblLook w:firstColumn="1" w:firstRow="1" w:lastColumn="0" w:lastRow="0" w:noHBand="0" w:noVBand="1" w:val="04A0"/>
-        <w:tblLayout w:type="fixed"/>
       </w:tblPr>
       <w:tblGrid>
         <w:gridCol w:w="1612"/>
@@ -7717,13 +7710,12 @@
         <w:tblW w:type="auto" w:w="0"/>
         <w:tblLayout w:type="fixed"/>
         <w:tblLook w:firstColumn="1" w:firstRow="1" w:lastColumn="0" w:lastRow="0" w:noHBand="0" w:noVBand="1" w:val="04A0"/>
-        <w:tblLayout w:type="fixed"/>
       </w:tblPr>
       <w:tblGrid>
-        <w:gridCol w:w="1759"/>
-        <w:gridCol w:w="3361"/>
-        <w:gridCol w:w="2672"/>
-        <w:gridCol w:w="1566"/>
+        <w:gridCol w:w="1737"/>
+        <w:gridCol w:w="3481"/>
+        <w:gridCol w:w="2601"/>
+        <w:gridCol w:w="1539"/>
       </w:tblGrid>
       <w:tr>
         <w:trPr>
@@ -7732,7 +7724,7 @@
         </w:trPr>
         <w:tc>
           <w:tcPr>
-            <w:tcW w:type="dxa" w:w="1759"/>
+            <w:tcW w:type="dxa" w:w="1737"/>
             <w:tcBorders>
               <w:top w:val="single" w:sz="4" w:color="000000"/>
               <w:left w:val="none" w:sz="0" w:color="FFFFFF"/>
@@ -7762,7 +7754,7 @@
         </w:tc>
         <w:tc>
           <w:tcPr>
-            <w:tcW w:type="dxa" w:w="3361"/>
+            <w:tcW w:type="dxa" w:w="3481"/>
             <w:tcBorders>
               <w:top w:val="single" w:sz="4" w:color="000000"/>
               <w:left w:val="none" w:sz="0" w:color="FFFFFF"/>
@@ -7792,7 +7784,7 @@
         </w:tc>
         <w:tc>
           <w:tcPr>
-            <w:tcW w:type="dxa" w:w="2673"/>
+            <w:tcW w:type="dxa" w:w="2602"/>
             <w:tcBorders>
               <w:top w:val="single" w:sz="4" w:color="000000"/>
               <w:left w:val="none" w:sz="0" w:color="FFFFFF"/>
@@ -7822,7 +7814,7 @@
         </w:tc>
         <w:tc>
           <w:tcPr>
-            <w:tcW w:type="dxa" w:w="1567"/>
+            <w:tcW w:type="dxa" w:w="1540"/>
             <w:tcBorders>
               <w:top w:val="single" w:sz="4" w:color="000000"/>
               <w:left w:val="none" w:sz="0" w:color="FFFFFF"/>
@@ -7857,7 +7849,7 @@
         </w:trPr>
         <w:tc>
           <w:tcPr>
-            <w:tcW w:type="dxa" w:w="1759"/>
+            <w:tcW w:type="dxa" w:w="1737"/>
             <w:tcBorders>
               <w:top w:val="none" w:sz="0" w:color="FFFFFF"/>
               <w:left w:val="none" w:sz="0" w:color="FFFFFF"/>
@@ -7887,7 +7879,7 @@
         </w:tc>
         <w:tc>
           <w:tcPr>
-            <w:tcW w:type="dxa" w:w="3361"/>
+            <w:tcW w:type="dxa" w:w="3481"/>
             <w:tcBorders>
               <w:top w:val="none" w:sz="0" w:color="FFFFFF"/>
               <w:left w:val="none" w:sz="0" w:color="FFFFFF"/>
@@ -7917,7 +7909,7 @@
         </w:tc>
         <w:tc>
           <w:tcPr>
-            <w:tcW w:type="dxa" w:w="2673"/>
+            <w:tcW w:type="dxa" w:w="2602"/>
             <w:tcBorders>
               <w:top w:val="none" w:sz="0" w:color="FFFFFF"/>
               <w:left w:val="none" w:sz="0" w:color="FFFFFF"/>
@@ -7947,7 +7939,7 @@
         </w:tc>
         <w:tc>
           <w:tcPr>
-            <w:tcW w:type="dxa" w:w="1567"/>
+            <w:tcW w:type="dxa" w:w="1540"/>
             <w:tcBorders>
               <w:top w:val="none" w:sz="0" w:color="FFFFFF"/>
               <w:left w:val="none" w:sz="0" w:color="FFFFFF"/>
@@ -7982,7 +7974,7 @@
         </w:trPr>
         <w:tc>
           <w:tcPr>
-            <w:tcW w:type="dxa" w:w="1759"/>
+            <w:tcW w:type="dxa" w:w="1737"/>
             <w:tcBorders>
               <w:top w:val="none" w:sz="0" w:color="FFFFFF"/>
               <w:left w:val="none" w:sz="0" w:color="FFFFFF"/>
@@ -8012,7 +8004,7 @@
         </w:tc>
         <w:tc>
           <w:tcPr>
-            <w:tcW w:type="dxa" w:w="3361"/>
+            <w:tcW w:type="dxa" w:w="3481"/>
             <w:tcBorders>
               <w:top w:val="none" w:sz="0" w:color="FFFFFF"/>
               <w:left w:val="none" w:sz="0" w:color="FFFFFF"/>
@@ -8042,7 +8034,7 @@
         </w:tc>
         <w:tc>
           <w:tcPr>
-            <w:tcW w:type="dxa" w:w="2673"/>
+            <w:tcW w:type="dxa" w:w="2602"/>
             <w:tcBorders>
               <w:top w:val="none" w:sz="0" w:color="FFFFFF"/>
               <w:left w:val="none" w:sz="0" w:color="FFFFFF"/>
@@ -8072,7 +8064,7 @@
         </w:tc>
         <w:tc>
           <w:tcPr>
-            <w:tcW w:type="dxa" w:w="1567"/>
+            <w:tcW w:type="dxa" w:w="1540"/>
             <w:tcBorders>
               <w:top w:val="none" w:sz="0" w:color="FFFFFF"/>
               <w:left w:val="none" w:sz="0" w:color="FFFFFF"/>
@@ -8107,7 +8099,7 @@
         </w:trPr>
         <w:tc>
           <w:tcPr>
-            <w:tcW w:type="dxa" w:w="1759"/>
+            <w:tcW w:type="dxa" w:w="1737"/>
             <w:tcBorders>
               <w:top w:val="none" w:sz="0" w:color="FFFFFF"/>
               <w:left w:val="none" w:sz="0" w:color="FFFFFF"/>
@@ -8137,7 +8129,7 @@
         </w:tc>
         <w:tc>
           <w:tcPr>
-            <w:tcW w:type="dxa" w:w="3361"/>
+            <w:tcW w:type="dxa" w:w="3481"/>
             <w:tcBorders>
               <w:top w:val="none" w:sz="0" w:color="FFFFFF"/>
               <w:left w:val="none" w:sz="0" w:color="FFFFFF"/>
@@ -8167,7 +8159,7 @@
         </w:tc>
         <w:tc>
           <w:tcPr>
-            <w:tcW w:type="dxa" w:w="2673"/>
+            <w:tcW w:type="dxa" w:w="2602"/>
             <w:tcBorders>
               <w:top w:val="none" w:sz="0" w:color="FFFFFF"/>
               <w:left w:val="none" w:sz="0" w:color="FFFFFF"/>
@@ -8197,7 +8189,7 @@
         </w:tc>
         <w:tc>
           <w:tcPr>
-            <w:tcW w:type="dxa" w:w="1567"/>
+            <w:tcW w:type="dxa" w:w="1540"/>
             <w:tcBorders>
               <w:top w:val="none" w:sz="0" w:color="FFFFFF"/>
               <w:left w:val="none" w:sz="0" w:color="FFFFFF"/>
@@ -8232,7 +8224,7 @@
         </w:trPr>
         <w:tc>
           <w:tcPr>
-            <w:tcW w:type="dxa" w:w="1759"/>
+            <w:tcW w:type="dxa" w:w="1737"/>
             <w:tcBorders>
               <w:top w:val="none" w:sz="0" w:color="FFFFFF"/>
               <w:left w:val="none" w:sz="0" w:color="FFFFFF"/>
@@ -8262,7 +8254,7 @@
         </w:tc>
         <w:tc>
           <w:tcPr>
-            <w:tcW w:type="dxa" w:w="3361"/>
+            <w:tcW w:type="dxa" w:w="3481"/>
             <w:tcBorders>
               <w:top w:val="none" w:sz="0" w:color="FFFFFF"/>
               <w:left w:val="none" w:sz="0" w:color="FFFFFF"/>
@@ -8292,7 +8284,7 @@
         </w:tc>
         <w:tc>
           <w:tcPr>
-            <w:tcW w:type="dxa" w:w="2673"/>
+            <w:tcW w:type="dxa" w:w="2602"/>
             <w:tcBorders>
               <w:top w:val="none" w:sz="0" w:color="FFFFFF"/>
               <w:left w:val="none" w:sz="0" w:color="FFFFFF"/>
@@ -8322,7 +8314,7 @@
         </w:tc>
         <w:tc>
           <w:tcPr>
-            <w:tcW w:type="dxa" w:w="1567"/>
+            <w:tcW w:type="dxa" w:w="1540"/>
             <w:tcBorders>
               <w:top w:val="none" w:sz="0" w:color="FFFFFF"/>
               <w:left w:val="none" w:sz="0" w:color="FFFFFF"/>
@@ -8357,7 +8349,7 @@
         </w:trPr>
         <w:tc>
           <w:tcPr>
-            <w:tcW w:type="dxa" w:w="1759"/>
+            <w:tcW w:type="dxa" w:w="1737"/>
             <w:tcBorders>
               <w:top w:val="none" w:sz="0" w:color="FFFFFF"/>
               <w:left w:val="none" w:sz="0" w:color="FFFFFF"/>
@@ -8387,7 +8379,7 @@
         </w:tc>
         <w:tc>
           <w:tcPr>
-            <w:tcW w:type="dxa" w:w="3361"/>
+            <w:tcW w:type="dxa" w:w="3481"/>
             <w:tcBorders>
               <w:top w:val="none" w:sz="0" w:color="FFFFFF"/>
               <w:left w:val="none" w:sz="0" w:color="FFFFFF"/>
@@ -8417,7 +8409,7 @@
         </w:tc>
         <w:tc>
           <w:tcPr>
-            <w:tcW w:type="dxa" w:w="2673"/>
+            <w:tcW w:type="dxa" w:w="2602"/>
             <w:tcBorders>
               <w:top w:val="none" w:sz="0" w:color="FFFFFF"/>
               <w:left w:val="none" w:sz="0" w:color="FFFFFF"/>
@@ -8447,7 +8439,7 @@
         </w:tc>
         <w:tc>
           <w:tcPr>
-            <w:tcW w:type="dxa" w:w="1567"/>
+            <w:tcW w:type="dxa" w:w="1540"/>
             <w:tcBorders>
               <w:top w:val="none" w:sz="0" w:color="FFFFFF"/>
               <w:left w:val="none" w:sz="0" w:color="FFFFFF"/>
@@ -8482,7 +8474,7 @@
         </w:trPr>
         <w:tc>
           <w:tcPr>
-            <w:tcW w:type="dxa" w:w="1759"/>
+            <w:tcW w:type="dxa" w:w="1737"/>
             <w:tcBorders>
               <w:top w:val="none" w:sz="0" w:color="FFFFFF"/>
               <w:left w:val="none" w:sz="0" w:color="FFFFFF"/>
@@ -8512,37 +8504,37 @@
         </w:tc>
         <w:tc>
           <w:tcPr>
-            <w:tcW w:type="dxa" w:w="3361"/>
-            <w:tcBorders>
-              <w:top w:val="none" w:sz="0" w:color="FFFFFF"/>
-              <w:left w:val="none" w:sz="0" w:color="FFFFFF"/>
-              <w:bottom w:val="none" w:sz="0" w:color="FFFFFF"/>
-              <w:right w:val="none" w:sz="0" w:color="FFFFFF"/>
-            </w:tcBorders>
-            <w:tcMar>
-              <w:top w:w="40" w:type="dxa"/>
-              <w:left w:w="90" w:type="dxa"/>
-              <w:bottom w:w="40" w:type="dxa"/>
-              <w:right w:w="90" w:type="dxa"/>
-            </w:tcMar>
-          </w:tcPr>
-          <w:p>
-            <w:pPr>
-              <w:spacing w:before="0" w:after="0" w:line="360" w:lineRule="auto"/>
-              <w:jc w:val="left"/>
-            </w:pPr>
-            <w:r>
-              <w:rPr>
-                <w:b w:val="0"/>
-                <w:sz w:val="18"/>
-              </w:rPr>
-              <w:t>gitleaks 8.30.1 (todo el historial)</w:t>
-            </w:r>
-          </w:p>
-        </w:tc>
-        <w:tc>
-          <w:tcPr>
-            <w:tcW w:type="dxa" w:w="2673"/>
+            <w:tcW w:type="dxa" w:w="3481"/>
+            <w:tcBorders>
+              <w:top w:val="none" w:sz="0" w:color="FFFFFF"/>
+              <w:left w:val="none" w:sz="0" w:color="FFFFFF"/>
+              <w:bottom w:val="none" w:sz="0" w:color="FFFFFF"/>
+              <w:right w:val="none" w:sz="0" w:color="FFFFFF"/>
+            </w:tcBorders>
+            <w:tcMar>
+              <w:top w:w="40" w:type="dxa"/>
+              <w:left w:w="90" w:type="dxa"/>
+              <w:bottom w:w="40" w:type="dxa"/>
+              <w:right w:w="90" w:type="dxa"/>
+            </w:tcMar>
+          </w:tcPr>
+          <w:p>
+            <w:pPr>
+              <w:spacing w:before="0" w:after="0" w:line="360" w:lineRule="auto"/>
+              <w:jc w:val="left"/>
+            </w:pPr>
+            <w:r>
+              <w:rPr>
+                <w:b w:val="0"/>
+                <w:sz w:val="18"/>
+              </w:rPr>
+              <w:t>gitleaks 8.30.1 (todo el historial: 89 commits, sin hallazgos)</w:t>
+            </w:r>
+          </w:p>
+        </w:tc>
+        <w:tc>
+          <w:tcPr>
+            <w:tcW w:type="dxa" w:w="2602"/>
             <w:tcBorders>
               <w:top w:val="none" w:sz="0" w:color="FFFFFF"/>
               <w:left w:val="none" w:sz="0" w:color="FFFFFF"/>
@@ -8572,7 +8564,7 @@
         </w:tc>
         <w:tc>
           <w:tcPr>
-            <w:tcW w:type="dxa" w:w="1567"/>
+            <w:tcW w:type="dxa" w:w="1540"/>
             <w:tcBorders>
               <w:top w:val="none" w:sz="0" w:color="FFFFFF"/>
               <w:left w:val="none" w:sz="0" w:color="FFFFFF"/>
@@ -8607,7 +8599,7 @@
         </w:trPr>
         <w:tc>
           <w:tcPr>
-            <w:tcW w:type="dxa" w:w="1759"/>
+            <w:tcW w:type="dxa" w:w="1737"/>
             <w:tcBorders>
               <w:top w:val="none" w:sz="0" w:color="FFFFFF"/>
               <w:left w:val="none" w:sz="0" w:color="FFFFFF"/>
@@ -8637,37 +8629,37 @@
         </w:tc>
         <w:tc>
           <w:tcPr>
-            <w:tcW w:type="dxa" w:w="3361"/>
-            <w:tcBorders>
-              <w:top w:val="none" w:sz="0" w:color="FFFFFF"/>
-              <w:left w:val="none" w:sz="0" w:color="FFFFFF"/>
-              <w:bottom w:val="none" w:sz="0" w:color="FFFFFF"/>
-              <w:right w:val="none" w:sz="0" w:color="FFFFFF"/>
-            </w:tcBorders>
-            <w:tcMar>
-              <w:top w:w="40" w:type="dxa"/>
-              <w:left w:w="90" w:type="dxa"/>
-              <w:bottom w:w="40" w:type="dxa"/>
-              <w:right w:w="90" w:type="dxa"/>
-            </w:tcMar>
-          </w:tcPr>
-          <w:p>
-            <w:pPr>
-              <w:spacing w:before="0" w:after="0" w:line="360" w:lineRule="auto"/>
-              <w:jc w:val="left"/>
-            </w:pPr>
-            <w:r>
-              <w:rPr>
-                <w:b w:val="0"/>
-                <w:sz w:val="18"/>
-              </w:rPr>
-              <w:t>Checkov 3.3.22, terraform validate</w:t>
-            </w:r>
-          </w:p>
-        </w:tc>
-        <w:tc>
-          <w:tcPr>
-            <w:tcW w:type="dxa" w:w="2673"/>
+            <w:tcW w:type="dxa" w:w="3481"/>
+            <w:tcBorders>
+              <w:top w:val="none" w:sz="0" w:color="FFFFFF"/>
+              <w:left w:val="none" w:sz="0" w:color="FFFFFF"/>
+              <w:bottom w:val="none" w:sz="0" w:color="FFFFFF"/>
+              <w:right w:val="none" w:sz="0" w:color="FFFFFF"/>
+            </w:tcBorders>
+            <w:tcMar>
+              <w:top w:w="40" w:type="dxa"/>
+              <w:left w:w="90" w:type="dxa"/>
+              <w:bottom w:w="40" w:type="dxa"/>
+              <w:right w:w="90" w:type="dxa"/>
+            </w:tcMar>
+          </w:tcPr>
+          <w:p>
+            <w:pPr>
+              <w:spacing w:before="0" w:after="0" w:line="360" w:lineRule="auto"/>
+              <w:jc w:val="left"/>
+            </w:pPr>
+            <w:r>
+              <w:rPr>
+                <w:b w:val="0"/>
+                <w:sz w:val="18"/>
+              </w:rPr>
+              <w:t>Checkov 3.3.22 (Terraform: 282 pasan; Dockerfile: 295 pasan; 0 fallan)</w:t>
+            </w:r>
+          </w:p>
+        </w:tc>
+        <w:tc>
+          <w:tcPr>
+            <w:tcW w:type="dxa" w:w="2602"/>
             <w:tcBorders>
               <w:top w:val="none" w:sz="0" w:color="FFFFFF"/>
               <w:left w:val="none" w:sz="0" w:color="FFFFFF"/>
@@ -8697,7 +8689,7 @@
         </w:tc>
         <w:tc>
           <w:tcPr>
-            <w:tcW w:type="dxa" w:w="1567"/>
+            <w:tcW w:type="dxa" w:w="1540"/>
             <w:tcBorders>
               <w:top w:val="none" w:sz="0" w:color="FFFFFF"/>
               <w:left w:val="none" w:sz="0" w:color="FFFFFF"/>
@@ -8732,7 +8724,7 @@
         </w:trPr>
         <w:tc>
           <w:tcPr>
-            <w:tcW w:type="dxa" w:w="1759"/>
+            <w:tcW w:type="dxa" w:w="1737"/>
             <w:tcBorders>
               <w:top w:val="none" w:sz="0" w:color="FFFFFF"/>
               <w:left w:val="none" w:sz="0" w:color="FFFFFF"/>
@@ -8762,7 +8754,7 @@
         </w:tc>
         <w:tc>
           <w:tcPr>
-            <w:tcW w:type="dxa" w:w="3361"/>
+            <w:tcW w:type="dxa" w:w="3481"/>
             <w:tcBorders>
               <w:top w:val="none" w:sz="0" w:color="FFFFFF"/>
               <w:left w:val="none" w:sz="0" w:color="FFFFFF"/>
@@ -8792,7 +8784,7 @@
         </w:tc>
         <w:tc>
           <w:tcPr>
-            <w:tcW w:type="dxa" w:w="2673"/>
+            <w:tcW w:type="dxa" w:w="2602"/>
             <w:tcBorders>
               <w:top w:val="none" w:sz="0" w:color="FFFFFF"/>
               <w:left w:val="none" w:sz="0" w:color="FFFFFF"/>
@@ -8822,7 +8814,7 @@
         </w:tc>
         <w:tc>
           <w:tcPr>
-            <w:tcW w:type="dxa" w:w="1567"/>
+            <w:tcW w:type="dxa" w:w="1540"/>
             <w:tcBorders>
               <w:top w:val="none" w:sz="0" w:color="FFFFFF"/>
               <w:left w:val="none" w:sz="0" w:color="FFFFFF"/>
@@ -8857,7 +8849,7 @@
         </w:trPr>
         <w:tc>
           <w:tcPr>
-            <w:tcW w:type="dxa" w:w="1759"/>
+            <w:tcW w:type="dxa" w:w="1737"/>
             <w:tcBorders>
               <w:top w:val="none" w:sz="0" w:color="FFFFFF"/>
               <w:left w:val="none" w:sz="0" w:color="FFFFFF"/>
@@ -8887,7 +8879,7 @@
         </w:tc>
         <w:tc>
           <w:tcPr>
-            <w:tcW w:type="dxa" w:w="3361"/>
+            <w:tcW w:type="dxa" w:w="3481"/>
             <w:tcBorders>
               <w:top w:val="none" w:sz="0" w:color="FFFFFF"/>
               <w:left w:val="none" w:sz="0" w:color="FFFFFF"/>
@@ -8917,7 +8909,7 @@
         </w:tc>
         <w:tc>
           <w:tcPr>
-            <w:tcW w:type="dxa" w:w="2673"/>
+            <w:tcW w:type="dxa" w:w="2602"/>
             <w:tcBorders>
               <w:top w:val="none" w:sz="0" w:color="FFFFFF"/>
               <w:left w:val="none" w:sz="0" w:color="FFFFFF"/>
@@ -8947,7 +8939,7 @@
         </w:tc>
         <w:tc>
           <w:tcPr>
-            <w:tcW w:type="dxa" w:w="1567"/>
+            <w:tcW w:type="dxa" w:w="1540"/>
             <w:tcBorders>
               <w:top w:val="none" w:sz="0" w:color="FFFFFF"/>
               <w:left w:val="none" w:sz="0" w:color="FFFFFF"/>
@@ -8982,7 +8974,7 @@
         </w:trPr>
         <w:tc>
           <w:tcPr>
-            <w:tcW w:type="dxa" w:w="1759"/>
+            <w:tcW w:type="dxa" w:w="1737"/>
             <w:tcBorders>
               <w:top w:val="none" w:sz="0" w:color="FFFFFF"/>
               <w:left w:val="none" w:sz="0" w:color="FFFFFF"/>
@@ -9012,7 +9004,7 @@
         </w:tc>
         <w:tc>
           <w:tcPr>
-            <w:tcW w:type="dxa" w:w="3361"/>
+            <w:tcW w:type="dxa" w:w="3481"/>
             <w:tcBorders>
               <w:top w:val="none" w:sz="0" w:color="FFFFFF"/>
               <w:left w:val="none" w:sz="0" w:color="FFFFFF"/>
@@ -9042,7 +9034,7 @@
         </w:tc>
         <w:tc>
           <w:tcPr>
-            <w:tcW w:type="dxa" w:w="2673"/>
+            <w:tcW w:type="dxa" w:w="2602"/>
             <w:tcBorders>
               <w:top w:val="none" w:sz="0" w:color="FFFFFF"/>
               <w:left w:val="none" w:sz="0" w:color="FFFFFF"/>
@@ -9072,7 +9064,7 @@
         </w:tc>
         <w:tc>
           <w:tcPr>
-            <w:tcW w:type="dxa" w:w="1567"/>
+            <w:tcW w:type="dxa" w:w="1540"/>
             <w:tcBorders>
               <w:top w:val="none" w:sz="0" w:color="FFFFFF"/>
               <w:left w:val="none" w:sz="0" w:color="FFFFFF"/>
@@ -9107,7 +9099,7 @@
         </w:trPr>
         <w:tc>
           <w:tcPr>
-            <w:tcW w:type="dxa" w:w="1759"/>
+            <w:tcW w:type="dxa" w:w="1737"/>
             <w:tcBorders>
               <w:top w:val="none" w:sz="0" w:color="FFFFFF"/>
               <w:left w:val="none" w:sz="0" w:color="FFFFFF"/>
@@ -9137,7 +9129,7 @@
         </w:tc>
         <w:tc>
           <w:tcPr>
-            <w:tcW w:type="dxa" w:w="3361"/>
+            <w:tcW w:type="dxa" w:w="3481"/>
             <w:tcBorders>
               <w:top w:val="none" w:sz="0" w:color="FFFFFF"/>
               <w:left w:val="none" w:sz="0" w:color="FFFFFF"/>
@@ -9167,7 +9159,7 @@
         </w:tc>
         <w:tc>
           <w:tcPr>
-            <w:tcW w:type="dxa" w:w="2673"/>
+            <w:tcW w:type="dxa" w:w="2602"/>
             <w:tcBorders>
               <w:top w:val="none" w:sz="0" w:color="FFFFFF"/>
               <w:left w:val="none" w:sz="0" w:color="FFFFFF"/>
@@ -9197,7 +9189,7 @@
         </w:tc>
         <w:tc>
           <w:tcPr>
-            <w:tcW w:type="dxa" w:w="1567"/>
+            <w:tcW w:type="dxa" w:w="1540"/>
             <w:tcBorders>
               <w:top w:val="none" w:sz="0" w:color="FFFFFF"/>
               <w:left w:val="none" w:sz="0" w:color="FFFFFF"/>
@@ -9232,7 +9224,7 @@
         </w:trPr>
         <w:tc>
           <w:tcPr>
-            <w:tcW w:type="dxa" w:w="1759"/>
+            <w:tcW w:type="dxa" w:w="1737"/>
             <w:tcBorders>
               <w:top w:val="none" w:sz="0" w:color="FFFFFF"/>
               <w:left w:val="none" w:sz="0" w:color="FFFFFF"/>
@@ -9262,7 +9254,7 @@
         </w:tc>
         <w:tc>
           <w:tcPr>
-            <w:tcW w:type="dxa" w:w="3361"/>
+            <w:tcW w:type="dxa" w:w="3481"/>
             <w:tcBorders>
               <w:top w:val="none" w:sz="0" w:color="FFFFFF"/>
               <w:left w:val="none" w:sz="0" w:color="FFFFFF"/>
@@ -9292,7 +9284,7 @@
         </w:tc>
         <w:tc>
           <w:tcPr>
-            <w:tcW w:type="dxa" w:w="2673"/>
+            <w:tcW w:type="dxa" w:w="2602"/>
             <w:tcBorders>
               <w:top w:val="none" w:sz="0" w:color="FFFFFF"/>
               <w:left w:val="none" w:sz="0" w:color="FFFFFF"/>
@@ -9322,7 +9314,7 @@
         </w:tc>
         <w:tc>
           <w:tcPr>
-            <w:tcW w:type="dxa" w:w="1567"/>
+            <w:tcW w:type="dxa" w:w="1540"/>
             <w:tcBorders>
               <w:top w:val="none" w:sz="0" w:color="FFFFFF"/>
               <w:left w:val="none" w:sz="0" w:color="FFFFFF"/>

</xml_diff>

<commit_message>
docs: build de release de la app validado con minSdk 29 (EVD-3-17)
Co-Authored-By: Claude Opus 5.5 <noreply@anthropic.com>
Claude-Session: https://claude.ai/code/session_017At5jrBqssTLVLpHCxyjLn
</commit_message>
<xml_diff>
--- a/docs/entregas/Final_Secciones_3-4_3-5_4-3_4-4_4-6_DevSecOps.docx
+++ b/docs/entregas/Final_Secciones_3-4_3-5_4-3_4-4_4-6_DevSecOps.docx
@@ -3945,10 +3945,10 @@
         <w:tblLook w:firstColumn="1" w:firstRow="1" w:lastColumn="0" w:lastRow="0" w:noHBand="0" w:noVBand="1" w:val="04A0"/>
       </w:tblPr>
       <w:tblGrid>
-        <w:gridCol w:w="1897"/>
-        <w:gridCol w:w="1507"/>
-        <w:gridCol w:w="4167"/>
-        <w:gridCol w:w="1787"/>
+        <w:gridCol w:w="1893"/>
+        <w:gridCol w:w="1505"/>
+        <w:gridCol w:w="4163"/>
+        <w:gridCol w:w="1797"/>
       </w:tblGrid>
       <w:tr>
         <w:trPr>
@@ -3957,7 +3957,7 @@
         </w:trPr>
         <w:tc>
           <w:tcPr>
-            <w:tcW w:type="dxa" w:w="1897"/>
+            <w:tcW w:type="dxa" w:w="1893"/>
             <w:tcBorders>
               <w:top w:val="single" w:sz="4" w:color="000000"/>
               <w:left w:val="none" w:sz="0" w:color="FFFFFF"/>
@@ -3987,7 +3987,7 @@
         </w:tc>
         <w:tc>
           <w:tcPr>
-            <w:tcW w:type="dxa" w:w="1507"/>
+            <w:tcW w:type="dxa" w:w="1506"/>
             <w:tcBorders>
               <w:top w:val="single" w:sz="4" w:color="000000"/>
               <w:left w:val="none" w:sz="0" w:color="FFFFFF"/>
@@ -4017,7 +4017,7 @@
         </w:tc>
         <w:tc>
           <w:tcPr>
-            <w:tcW w:type="dxa" w:w="4168"/>
+            <w:tcW w:type="dxa" w:w="4164"/>
             <w:tcBorders>
               <w:top w:val="single" w:sz="4" w:color="000000"/>
               <w:left w:val="none" w:sz="0" w:color="FFFFFF"/>
@@ -4047,7 +4047,7 @@
         </w:tc>
         <w:tc>
           <w:tcPr>
-            <w:tcW w:type="dxa" w:w="1788"/>
+            <w:tcW w:type="dxa" w:w="1797"/>
             <w:tcBorders>
               <w:top w:val="single" w:sz="4" w:color="000000"/>
               <w:left w:val="none" w:sz="0" w:color="FFFFFF"/>
@@ -4082,7 +4082,7 @@
         </w:trPr>
         <w:tc>
           <w:tcPr>
-            <w:tcW w:type="dxa" w:w="1897"/>
+            <w:tcW w:type="dxa" w:w="1893"/>
             <w:tcBorders>
               <w:top w:val="none" w:sz="0" w:color="FFFFFF"/>
               <w:left w:val="none" w:sz="0" w:color="FFFFFF"/>
@@ -4112,7 +4112,7 @@
         </w:tc>
         <w:tc>
           <w:tcPr>
-            <w:tcW w:type="dxa" w:w="1507"/>
+            <w:tcW w:type="dxa" w:w="1506"/>
             <w:tcBorders>
               <w:top w:val="none" w:sz="0" w:color="FFFFFF"/>
               <w:left w:val="none" w:sz="0" w:color="FFFFFF"/>
@@ -4142,7 +4142,7 @@
         </w:tc>
         <w:tc>
           <w:tcPr>
-            <w:tcW w:type="dxa" w:w="4168"/>
+            <w:tcW w:type="dxa" w:w="4164"/>
             <w:tcBorders>
               <w:top w:val="none" w:sz="0" w:color="FFFFFF"/>
               <w:left w:val="none" w:sz="0" w:color="FFFFFF"/>
@@ -4172,31 +4172,31 @@
         </w:tc>
         <w:tc>
           <w:tcPr>
-            <w:tcW w:type="dxa" w:w="1788"/>
-            <w:tcBorders>
-              <w:top w:val="none" w:sz="0" w:color="FFFFFF"/>
-              <w:left w:val="none" w:sz="0" w:color="FFFFFF"/>
-              <w:bottom w:val="none" w:sz="0" w:color="FFFFFF"/>
-              <w:right w:val="none" w:sz="0" w:color="FFFFFF"/>
-            </w:tcBorders>
-            <w:tcMar>
-              <w:top w:w="40" w:type="dxa"/>
-              <w:left w:w="90" w:type="dxa"/>
-              <w:bottom w:w="40" w:type="dxa"/>
-              <w:right w:w="90" w:type="dxa"/>
-            </w:tcMar>
-          </w:tcPr>
-          <w:p>
-            <w:pPr>
-              <w:spacing w:before="0" w:after="0" w:line="360" w:lineRule="auto"/>
-              <w:jc w:val="left"/>
-            </w:pPr>
-            <w:r>
-              <w:rPr>
-                <w:b w:val="0"/>
-                <w:sz w:val="18"/>
-              </w:rPr>
-              <w:t>Configurado (bloque 3)</w:t>
+            <w:tcW w:type="dxa" w:w="1797"/>
+            <w:tcBorders>
+              <w:top w:val="none" w:sz="0" w:color="FFFFFF"/>
+              <w:left w:val="none" w:sz="0" w:color="FFFFFF"/>
+              <w:bottom w:val="none" w:sz="0" w:color="FFFFFF"/>
+              <w:right w:val="none" w:sz="0" w:color="FFFFFF"/>
+            </w:tcBorders>
+            <w:tcMar>
+              <w:top w:w="40" w:type="dxa"/>
+              <w:left w:w="90" w:type="dxa"/>
+              <w:bottom w:w="40" w:type="dxa"/>
+              <w:right w:w="90" w:type="dxa"/>
+            </w:tcMar>
+          </w:tcPr>
+          <w:p>
+            <w:pPr>
+              <w:spacing w:before="0" w:after="0" w:line="360" w:lineRule="auto"/>
+              <w:jc w:val="left"/>
+            </w:pPr>
+            <w:r>
+              <w:rPr>
+                <w:b w:val="0"/>
+                <w:sz w:val="18"/>
+              </w:rPr>
+              <w:t>Configurado y compilado</w:t>
             </w:r>
           </w:p>
         </w:tc>
@@ -4207,7 +4207,7 @@
         </w:trPr>
         <w:tc>
           <w:tcPr>
-            <w:tcW w:type="dxa" w:w="1897"/>
+            <w:tcW w:type="dxa" w:w="1893"/>
             <w:tcBorders>
               <w:top w:val="none" w:sz="0" w:color="FFFFFF"/>
               <w:left w:val="none" w:sz="0" w:color="FFFFFF"/>
@@ -4237,7 +4237,7 @@
         </w:tc>
         <w:tc>
           <w:tcPr>
-            <w:tcW w:type="dxa" w:w="1507"/>
+            <w:tcW w:type="dxa" w:w="1506"/>
             <w:tcBorders>
               <w:top w:val="none" w:sz="0" w:color="FFFFFF"/>
               <w:left w:val="none" w:sz="0" w:color="FFFFFF"/>
@@ -4267,7 +4267,7 @@
         </w:tc>
         <w:tc>
           <w:tcPr>
-            <w:tcW w:type="dxa" w:w="4168"/>
+            <w:tcW w:type="dxa" w:w="4164"/>
             <w:tcBorders>
               <w:top w:val="none" w:sz="0" w:color="FFFFFF"/>
               <w:left w:val="none" w:sz="0" w:color="FFFFFF"/>
@@ -4297,31 +4297,31 @@
         </w:tc>
         <w:tc>
           <w:tcPr>
-            <w:tcW w:type="dxa" w:w="1788"/>
-            <w:tcBorders>
-              <w:top w:val="none" w:sz="0" w:color="FFFFFF"/>
-              <w:left w:val="none" w:sz="0" w:color="FFFFFF"/>
-              <w:bottom w:val="none" w:sz="0" w:color="FFFFFF"/>
-              <w:right w:val="none" w:sz="0" w:color="FFFFFF"/>
-            </w:tcBorders>
-            <w:tcMar>
-              <w:top w:w="40" w:type="dxa"/>
-              <w:left w:w="90" w:type="dxa"/>
-              <w:bottom w:w="40" w:type="dxa"/>
-              <w:right w:w="90" w:type="dxa"/>
-            </w:tcMar>
-          </w:tcPr>
-          <w:p>
-            <w:pPr>
-              <w:spacing w:before="0" w:after="0" w:line="360" w:lineRule="auto"/>
-              <w:jc w:val="left"/>
-            </w:pPr>
-            <w:r>
-              <w:rPr>
-                <w:b w:val="0"/>
-                <w:sz w:val="18"/>
-              </w:rPr>
-              <w:t>Configurado (bloque 3)</w:t>
+            <w:tcW w:type="dxa" w:w="1797"/>
+            <w:tcBorders>
+              <w:top w:val="none" w:sz="0" w:color="FFFFFF"/>
+              <w:left w:val="none" w:sz="0" w:color="FFFFFF"/>
+              <w:bottom w:val="none" w:sz="0" w:color="FFFFFF"/>
+              <w:right w:val="none" w:sz="0" w:color="FFFFFF"/>
+            </w:tcBorders>
+            <w:tcMar>
+              <w:top w:w="40" w:type="dxa"/>
+              <w:left w:w="90" w:type="dxa"/>
+              <w:bottom w:w="40" w:type="dxa"/>
+              <w:right w:w="90" w:type="dxa"/>
+            </w:tcMar>
+          </w:tcPr>
+          <w:p>
+            <w:pPr>
+              <w:spacing w:before="0" w:after="0" w:line="360" w:lineRule="auto"/>
+              <w:jc w:val="left"/>
+            </w:pPr>
+            <w:r>
+              <w:rPr>
+                <w:b w:val="0"/>
+                <w:sz w:val="18"/>
+              </w:rPr>
+              <w:t>Configurado y compilado</w:t>
             </w:r>
           </w:p>
         </w:tc>
@@ -4332,7 +4332,7 @@
         </w:trPr>
         <w:tc>
           <w:tcPr>
-            <w:tcW w:type="dxa" w:w="1897"/>
+            <w:tcW w:type="dxa" w:w="1893"/>
             <w:tcBorders>
               <w:top w:val="none" w:sz="0" w:color="FFFFFF"/>
               <w:left w:val="none" w:sz="0" w:color="FFFFFF"/>
@@ -4362,7 +4362,7 @@
         </w:tc>
         <w:tc>
           <w:tcPr>
-            <w:tcW w:type="dxa" w:w="1507"/>
+            <w:tcW w:type="dxa" w:w="1506"/>
             <w:tcBorders>
               <w:top w:val="none" w:sz="0" w:color="FFFFFF"/>
               <w:left w:val="none" w:sz="0" w:color="FFFFFF"/>
@@ -4392,7 +4392,7 @@
         </w:tc>
         <w:tc>
           <w:tcPr>
-            <w:tcW w:type="dxa" w:w="4168"/>
+            <w:tcW w:type="dxa" w:w="4164"/>
             <w:tcBorders>
               <w:top w:val="none" w:sz="0" w:color="FFFFFF"/>
               <w:left w:val="none" w:sz="0" w:color="FFFFFF"/>
@@ -4422,31 +4422,31 @@
         </w:tc>
         <w:tc>
           <w:tcPr>
-            <w:tcW w:type="dxa" w:w="1788"/>
-            <w:tcBorders>
-              <w:top w:val="none" w:sz="0" w:color="FFFFFF"/>
-              <w:left w:val="none" w:sz="0" w:color="FFFFFF"/>
-              <w:bottom w:val="none" w:sz="0" w:color="FFFFFF"/>
-              <w:right w:val="none" w:sz="0" w:color="FFFFFF"/>
-            </w:tcBorders>
-            <w:tcMar>
-              <w:top w:w="40" w:type="dxa"/>
-              <w:left w:w="90" w:type="dxa"/>
-              <w:bottom w:w="40" w:type="dxa"/>
-              <w:right w:w="90" w:type="dxa"/>
-            </w:tcMar>
-          </w:tcPr>
-          <w:p>
-            <w:pPr>
-              <w:spacing w:before="0" w:after="0" w:line="360" w:lineRule="auto"/>
-              <w:jc w:val="left"/>
-            </w:pPr>
-            <w:r>
-              <w:rPr>
-                <w:b w:val="0"/>
-                <w:sz w:val="18"/>
-              </w:rPr>
-              <w:t>Configurado (bloque 3)</w:t>
+            <w:tcW w:type="dxa" w:w="1797"/>
+            <w:tcBorders>
+              <w:top w:val="none" w:sz="0" w:color="FFFFFF"/>
+              <w:left w:val="none" w:sz="0" w:color="FFFFFF"/>
+              <w:bottom w:val="none" w:sz="0" w:color="FFFFFF"/>
+              <w:right w:val="none" w:sz="0" w:color="FFFFFF"/>
+            </w:tcBorders>
+            <w:tcMar>
+              <w:top w:w="40" w:type="dxa"/>
+              <w:left w:w="90" w:type="dxa"/>
+              <w:bottom w:w="40" w:type="dxa"/>
+              <w:right w:w="90" w:type="dxa"/>
+            </w:tcMar>
+          </w:tcPr>
+          <w:p>
+            <w:pPr>
+              <w:spacing w:before="0" w:after="0" w:line="360" w:lineRule="auto"/>
+              <w:jc w:val="left"/>
+            </w:pPr>
+            <w:r>
+              <w:rPr>
+                <w:b w:val="0"/>
+                <w:sz w:val="18"/>
+              </w:rPr>
+              <w:t>Configurado y compilado</w:t>
             </w:r>
           </w:p>
         </w:tc>
@@ -4457,7 +4457,7 @@
         </w:trPr>
         <w:tc>
           <w:tcPr>
-            <w:tcW w:type="dxa" w:w="1897"/>
+            <w:tcW w:type="dxa" w:w="1893"/>
             <w:tcBorders>
               <w:top w:val="none" w:sz="0" w:color="FFFFFF"/>
               <w:left w:val="none" w:sz="0" w:color="FFFFFF"/>
@@ -4487,7 +4487,7 @@
         </w:tc>
         <w:tc>
           <w:tcPr>
-            <w:tcW w:type="dxa" w:w="1507"/>
+            <w:tcW w:type="dxa" w:w="1506"/>
             <w:tcBorders>
               <w:top w:val="none" w:sz="0" w:color="FFFFFF"/>
               <w:left w:val="none" w:sz="0" w:color="FFFFFF"/>
@@ -4517,7 +4517,7 @@
         </w:tc>
         <w:tc>
           <w:tcPr>
-            <w:tcW w:type="dxa" w:w="4168"/>
+            <w:tcW w:type="dxa" w:w="4164"/>
             <w:tcBorders>
               <w:top w:val="none" w:sz="0" w:color="FFFFFF"/>
               <w:left w:val="none" w:sz="0" w:color="FFFFFF"/>
@@ -4547,31 +4547,31 @@
         </w:tc>
         <w:tc>
           <w:tcPr>
-            <w:tcW w:type="dxa" w:w="1788"/>
-            <w:tcBorders>
-              <w:top w:val="none" w:sz="0" w:color="FFFFFF"/>
-              <w:left w:val="none" w:sz="0" w:color="FFFFFF"/>
-              <w:bottom w:val="none" w:sz="0" w:color="FFFFFF"/>
-              <w:right w:val="none" w:sz="0" w:color="FFFFFF"/>
-            </w:tcBorders>
-            <w:tcMar>
-              <w:top w:w="40" w:type="dxa"/>
-              <w:left w:w="90" w:type="dxa"/>
-              <w:bottom w:w="40" w:type="dxa"/>
-              <w:right w:w="90" w:type="dxa"/>
-            </w:tcMar>
-          </w:tcPr>
-          <w:p>
-            <w:pPr>
-              <w:spacing w:before="0" w:after="0" w:line="360" w:lineRule="auto"/>
-              <w:jc w:val="left"/>
-            </w:pPr>
-            <w:r>
-              <w:rPr>
-                <w:b w:val="0"/>
-                <w:sz w:val="18"/>
-              </w:rPr>
-              <w:t>Configurado (bloque 3)</w:t>
+            <w:tcW w:type="dxa" w:w="1797"/>
+            <w:tcBorders>
+              <w:top w:val="none" w:sz="0" w:color="FFFFFF"/>
+              <w:left w:val="none" w:sz="0" w:color="FFFFFF"/>
+              <w:bottom w:val="none" w:sz="0" w:color="FFFFFF"/>
+              <w:right w:val="none" w:sz="0" w:color="FFFFFF"/>
+            </w:tcBorders>
+            <w:tcMar>
+              <w:top w:w="40" w:type="dxa"/>
+              <w:left w:w="90" w:type="dxa"/>
+              <w:bottom w:w="40" w:type="dxa"/>
+              <w:right w:w="90" w:type="dxa"/>
+            </w:tcMar>
+          </w:tcPr>
+          <w:p>
+            <w:pPr>
+              <w:spacing w:before="0" w:after="0" w:line="360" w:lineRule="auto"/>
+              <w:jc w:val="left"/>
+            </w:pPr>
+            <w:r>
+              <w:rPr>
+                <w:b w:val="0"/>
+                <w:sz w:val="18"/>
+              </w:rPr>
+              <w:t>Configurado y compilado</w:t>
             </w:r>
           </w:p>
         </w:tc>
@@ -4582,7 +4582,7 @@
         </w:trPr>
         <w:tc>
           <w:tcPr>
-            <w:tcW w:type="dxa" w:w="1897"/>
+            <w:tcW w:type="dxa" w:w="1893"/>
             <w:tcBorders>
               <w:top w:val="none" w:sz="0" w:color="FFFFFF"/>
               <w:left w:val="none" w:sz="0" w:color="FFFFFF"/>
@@ -4612,7 +4612,7 @@
         </w:tc>
         <w:tc>
           <w:tcPr>
-            <w:tcW w:type="dxa" w:w="1507"/>
+            <w:tcW w:type="dxa" w:w="1506"/>
             <w:tcBorders>
               <w:top w:val="none" w:sz="0" w:color="FFFFFF"/>
               <w:left w:val="none" w:sz="0" w:color="FFFFFF"/>
@@ -4642,7 +4642,7 @@
         </w:tc>
         <w:tc>
           <w:tcPr>
-            <w:tcW w:type="dxa" w:w="4168"/>
+            <w:tcW w:type="dxa" w:w="4164"/>
             <w:tcBorders>
               <w:top w:val="none" w:sz="0" w:color="FFFFFF"/>
               <w:left w:val="none" w:sz="0" w:color="FFFFFF"/>
@@ -4672,7 +4672,7 @@
         </w:tc>
         <w:tc>
           <w:tcPr>
-            <w:tcW w:type="dxa" w:w="1788"/>
+            <w:tcW w:type="dxa" w:w="1797"/>
             <w:tcBorders>
               <w:top w:val="none" w:sz="0" w:color="FFFFFF"/>
               <w:left w:val="none" w:sz="0" w:color="FFFFFF"/>
@@ -4707,7 +4707,7 @@
         </w:trPr>
         <w:tc>
           <w:tcPr>
-            <w:tcW w:type="dxa" w:w="1897"/>
+            <w:tcW w:type="dxa" w:w="1893"/>
             <w:tcBorders>
               <w:top w:val="none" w:sz="0" w:color="FFFFFF"/>
               <w:left w:val="none" w:sz="0" w:color="FFFFFF"/>
@@ -4737,7 +4737,7 @@
         </w:tc>
         <w:tc>
           <w:tcPr>
-            <w:tcW w:type="dxa" w:w="1507"/>
+            <w:tcW w:type="dxa" w:w="1506"/>
             <w:tcBorders>
               <w:top w:val="none" w:sz="0" w:color="FFFFFF"/>
               <w:left w:val="none" w:sz="0" w:color="FFFFFF"/>
@@ -4767,7 +4767,7 @@
         </w:tc>
         <w:tc>
           <w:tcPr>
-            <w:tcW w:type="dxa" w:w="4168"/>
+            <w:tcW w:type="dxa" w:w="4164"/>
             <w:tcBorders>
               <w:top w:val="none" w:sz="0" w:color="FFFFFF"/>
               <w:left w:val="none" w:sz="0" w:color="FFFFFF"/>
@@ -4797,7 +4797,7 @@
         </w:tc>
         <w:tc>
           <w:tcPr>
-            <w:tcW w:type="dxa" w:w="1788"/>
+            <w:tcW w:type="dxa" w:w="1797"/>
             <w:tcBorders>
               <w:top w:val="none" w:sz="0" w:color="FFFFFF"/>
               <w:left w:val="none" w:sz="0" w:color="FFFFFF"/>
@@ -4832,7 +4832,7 @@
         </w:trPr>
         <w:tc>
           <w:tcPr>
-            <w:tcW w:type="dxa" w:w="1897"/>
+            <w:tcW w:type="dxa" w:w="1893"/>
             <w:tcBorders>
               <w:top w:val="none" w:sz="0" w:color="FFFFFF"/>
               <w:left w:val="none" w:sz="0" w:color="FFFFFF"/>
@@ -4862,7 +4862,7 @@
         </w:tc>
         <w:tc>
           <w:tcPr>
-            <w:tcW w:type="dxa" w:w="1507"/>
+            <w:tcW w:type="dxa" w:w="1506"/>
             <w:tcBorders>
               <w:top w:val="none" w:sz="0" w:color="FFFFFF"/>
               <w:left w:val="none" w:sz="0" w:color="FFFFFF"/>
@@ -4892,7 +4892,7 @@
         </w:tc>
         <w:tc>
           <w:tcPr>
-            <w:tcW w:type="dxa" w:w="4168"/>
+            <w:tcW w:type="dxa" w:w="4164"/>
             <w:tcBorders>
               <w:top w:val="none" w:sz="0" w:color="FFFFFF"/>
               <w:left w:val="none" w:sz="0" w:color="FFFFFF"/>
@@ -4922,7 +4922,7 @@
         </w:tc>
         <w:tc>
           <w:tcPr>
-            <w:tcW w:type="dxa" w:w="1788"/>
+            <w:tcW w:type="dxa" w:w="1797"/>
             <w:tcBorders>
               <w:top w:val="none" w:sz="0" w:color="FFFFFF"/>
               <w:left w:val="none" w:sz="0" w:color="FFFFFF"/>
@@ -4957,7 +4957,7 @@
         </w:trPr>
         <w:tc>
           <w:tcPr>
-            <w:tcW w:type="dxa" w:w="1897"/>
+            <w:tcW w:type="dxa" w:w="1893"/>
             <w:tcBorders>
               <w:top w:val="none" w:sz="0" w:color="FFFFFF"/>
               <w:left w:val="none" w:sz="0" w:color="FFFFFF"/>
@@ -4987,7 +4987,7 @@
         </w:tc>
         <w:tc>
           <w:tcPr>
-            <w:tcW w:type="dxa" w:w="1507"/>
+            <w:tcW w:type="dxa" w:w="1506"/>
             <w:tcBorders>
               <w:top w:val="none" w:sz="0" w:color="FFFFFF"/>
               <w:left w:val="none" w:sz="0" w:color="FFFFFF"/>
@@ -5017,7 +5017,7 @@
         </w:tc>
         <w:tc>
           <w:tcPr>
-            <w:tcW w:type="dxa" w:w="4168"/>
+            <w:tcW w:type="dxa" w:w="4164"/>
             <w:tcBorders>
               <w:top w:val="none" w:sz="0" w:color="FFFFFF"/>
               <w:left w:val="none" w:sz="0" w:color="FFFFFF"/>
@@ -5047,7 +5047,7 @@
         </w:tc>
         <w:tc>
           <w:tcPr>
-            <w:tcW w:type="dxa" w:w="1788"/>
+            <w:tcW w:type="dxa" w:w="1797"/>
             <w:tcBorders>
               <w:top w:val="none" w:sz="0" w:color="FFFFFF"/>
               <w:left w:val="none" w:sz="0" w:color="FFFFFF"/>
@@ -5082,7 +5082,7 @@
         </w:trPr>
         <w:tc>
           <w:tcPr>
-            <w:tcW w:type="dxa" w:w="1897"/>
+            <w:tcW w:type="dxa" w:w="1893"/>
             <w:tcBorders>
               <w:top w:val="none" w:sz="0" w:color="FFFFFF"/>
               <w:left w:val="none" w:sz="0" w:color="FFFFFF"/>
@@ -5112,7 +5112,7 @@
         </w:tc>
         <w:tc>
           <w:tcPr>
-            <w:tcW w:type="dxa" w:w="1507"/>
+            <w:tcW w:type="dxa" w:w="1506"/>
             <w:tcBorders>
               <w:top w:val="none" w:sz="0" w:color="FFFFFF"/>
               <w:left w:val="none" w:sz="0" w:color="FFFFFF"/>
@@ -5142,7 +5142,7 @@
         </w:tc>
         <w:tc>
           <w:tcPr>
-            <w:tcW w:type="dxa" w:w="4168"/>
+            <w:tcW w:type="dxa" w:w="4164"/>
             <w:tcBorders>
               <w:top w:val="none" w:sz="0" w:color="FFFFFF"/>
               <w:left w:val="none" w:sz="0" w:color="FFFFFF"/>
@@ -5172,7 +5172,7 @@
         </w:tc>
         <w:tc>
           <w:tcPr>
-            <w:tcW w:type="dxa" w:w="1788"/>
+            <w:tcW w:type="dxa" w:w="1797"/>
             <w:tcBorders>
               <w:top w:val="none" w:sz="0" w:color="FFFFFF"/>
               <w:left w:val="none" w:sz="0" w:color="FFFFFF"/>
@@ -5207,7 +5207,7 @@
         </w:trPr>
         <w:tc>
           <w:tcPr>
-            <w:tcW w:type="dxa" w:w="1897"/>
+            <w:tcW w:type="dxa" w:w="1893"/>
             <w:tcBorders>
               <w:top w:val="none" w:sz="0" w:color="FFFFFF"/>
               <w:left w:val="none" w:sz="0" w:color="FFFFFF"/>
@@ -5237,7 +5237,7 @@
         </w:tc>
         <w:tc>
           <w:tcPr>
-            <w:tcW w:type="dxa" w:w="1507"/>
+            <w:tcW w:type="dxa" w:w="1506"/>
             <w:tcBorders>
               <w:top w:val="none" w:sz="0" w:color="FFFFFF"/>
               <w:left w:val="none" w:sz="0" w:color="FFFFFF"/>
@@ -5267,7 +5267,7 @@
         </w:tc>
         <w:tc>
           <w:tcPr>
-            <w:tcW w:type="dxa" w:w="4168"/>
+            <w:tcW w:type="dxa" w:w="4164"/>
             <w:tcBorders>
               <w:top w:val="none" w:sz="0" w:color="FFFFFF"/>
               <w:left w:val="none" w:sz="0" w:color="FFFFFF"/>
@@ -5297,7 +5297,7 @@
         </w:tc>
         <w:tc>
           <w:tcPr>
-            <w:tcW w:type="dxa" w:w="1788"/>
+            <w:tcW w:type="dxa" w:w="1797"/>
             <w:tcBorders>
               <w:top w:val="none" w:sz="0" w:color="FFFFFF"/>
               <w:left w:val="none" w:sz="0" w:color="FFFFFF"/>
@@ -5332,7 +5332,7 @@
         </w:trPr>
         <w:tc>
           <w:tcPr>
-            <w:tcW w:type="dxa" w:w="1897"/>
+            <w:tcW w:type="dxa" w:w="1893"/>
             <w:tcBorders>
               <w:top w:val="none" w:sz="0" w:color="FFFFFF"/>
               <w:left w:val="none" w:sz="0" w:color="FFFFFF"/>
@@ -5362,7 +5362,7 @@
         </w:tc>
         <w:tc>
           <w:tcPr>
-            <w:tcW w:type="dxa" w:w="1507"/>
+            <w:tcW w:type="dxa" w:w="1506"/>
             <w:tcBorders>
               <w:top w:val="none" w:sz="0" w:color="FFFFFF"/>
               <w:left w:val="none" w:sz="0" w:color="FFFFFF"/>
@@ -5392,7 +5392,7 @@
         </w:tc>
         <w:tc>
           <w:tcPr>
-            <w:tcW w:type="dxa" w:w="4168"/>
+            <w:tcW w:type="dxa" w:w="4164"/>
             <w:tcBorders>
               <w:top w:val="none" w:sz="0" w:color="FFFFFF"/>
               <w:left w:val="none" w:sz="0" w:color="FFFFFF"/>
@@ -5422,7 +5422,7 @@
         </w:tc>
         <w:tc>
           <w:tcPr>
-            <w:tcW w:type="dxa" w:w="1788"/>
+            <w:tcW w:type="dxa" w:w="1797"/>
             <w:tcBorders>
               <w:top w:val="none" w:sz="0" w:color="FFFFFF"/>
               <w:left w:val="none" w:sz="0" w:color="FFFFFF"/>
@@ -5457,7 +5457,7 @@
         </w:trPr>
         <w:tc>
           <w:tcPr>
-            <w:tcW w:type="dxa" w:w="1897"/>
+            <w:tcW w:type="dxa" w:w="1893"/>
             <w:tcBorders>
               <w:top w:val="none" w:sz="0" w:color="FFFFFF"/>
               <w:left w:val="none" w:sz="0" w:color="FFFFFF"/>
@@ -5487,7 +5487,7 @@
         </w:tc>
         <w:tc>
           <w:tcPr>
-            <w:tcW w:type="dxa" w:w="1507"/>
+            <w:tcW w:type="dxa" w:w="1506"/>
             <w:tcBorders>
               <w:top w:val="none" w:sz="0" w:color="FFFFFF"/>
               <w:left w:val="none" w:sz="0" w:color="FFFFFF"/>
@@ -5517,7 +5517,7 @@
         </w:tc>
         <w:tc>
           <w:tcPr>
-            <w:tcW w:type="dxa" w:w="4168"/>
+            <w:tcW w:type="dxa" w:w="4164"/>
             <w:tcBorders>
               <w:top w:val="none" w:sz="0" w:color="FFFFFF"/>
               <w:left w:val="none" w:sz="0" w:color="FFFFFF"/>
@@ -5547,7 +5547,7 @@
         </w:tc>
         <w:tc>
           <w:tcPr>
-            <w:tcW w:type="dxa" w:w="1788"/>
+            <w:tcW w:type="dxa" w:w="1797"/>
             <w:tcBorders>
               <w:top w:val="none" w:sz="0" w:color="FFFFFF"/>
               <w:left w:val="none" w:sz="0" w:color="FFFFFF"/>
@@ -5593,7 +5593,7 @@
         <w:rPr>
           <w:sz w:val="24"/>
         </w:rPr>
-        <w:t>MASVS = OWASP Mobile Application Security Verification Standard 2.1.0. Lo configurado en el bloque 3 se aplica al generar el proyecto nativo; falta comprobarlo con una compilación de release en el equipo de desarrollo y con MobSF (evidencia EVD-3-07).</w:t>
+        <w:t>MASVS = OWASP Mobile Application Security Verification Standard 2.1.0. Lo configurado en el bloque 3 se aplica al generar el proyecto nativo; el 30 de octubre compilamos la versión de release con esa configuración y la app abrió en el emulador (EVD-3-17). El análisis del APK con MobSF queda para la Fase 4 (EVD-3-07).</w:t>
       </w:r>
     </w:p>
     <w:p>

</xml_diff>

<commit_message>
docs: el build del 30-oct salió de main; la validación de minSdk 29 queda pendiente
Co-Authored-By: Claude Opus 5.5 <noreply@anthropic.com>
Claude-Session: https://claude.ai/code/session_017At5jrBqssTLVLpHCxyjLn
</commit_message>
<xml_diff>
--- a/docs/entregas/Final_Secciones_3-4_3-5_4-3_4-4_4-6_DevSecOps.docx
+++ b/docs/entregas/Final_Secciones_3-4_3-5_4-3_4-4_4-6_DevSecOps.docx
@@ -3945,10 +3945,10 @@
         <w:tblLook w:firstColumn="1" w:firstRow="1" w:lastColumn="0" w:lastRow="0" w:noHBand="0" w:noVBand="1" w:val="04A0"/>
       </w:tblPr>
       <w:tblGrid>
-        <w:gridCol w:w="1893"/>
-        <w:gridCol w:w="1505"/>
-        <w:gridCol w:w="4163"/>
-        <w:gridCol w:w="1797"/>
+        <w:gridCol w:w="1897"/>
+        <w:gridCol w:w="1507"/>
+        <w:gridCol w:w="4167"/>
+        <w:gridCol w:w="1787"/>
       </w:tblGrid>
       <w:tr>
         <w:trPr>
@@ -3957,7 +3957,7 @@
         </w:trPr>
         <w:tc>
           <w:tcPr>
-            <w:tcW w:type="dxa" w:w="1893"/>
+            <w:tcW w:type="dxa" w:w="1897"/>
             <w:tcBorders>
               <w:top w:val="single" w:sz="4" w:color="000000"/>
               <w:left w:val="none" w:sz="0" w:color="FFFFFF"/>
@@ -3987,7 +3987,7 @@
         </w:tc>
         <w:tc>
           <w:tcPr>
-            <w:tcW w:type="dxa" w:w="1506"/>
+            <w:tcW w:type="dxa" w:w="1507"/>
             <w:tcBorders>
               <w:top w:val="single" w:sz="4" w:color="000000"/>
               <w:left w:val="none" w:sz="0" w:color="FFFFFF"/>
@@ -4017,7 +4017,7 @@
         </w:tc>
         <w:tc>
           <w:tcPr>
-            <w:tcW w:type="dxa" w:w="4164"/>
+            <w:tcW w:type="dxa" w:w="4168"/>
             <w:tcBorders>
               <w:top w:val="single" w:sz="4" w:color="000000"/>
               <w:left w:val="none" w:sz="0" w:color="FFFFFF"/>
@@ -4047,7 +4047,7 @@
         </w:tc>
         <w:tc>
           <w:tcPr>
-            <w:tcW w:type="dxa" w:w="1797"/>
+            <w:tcW w:type="dxa" w:w="1788"/>
             <w:tcBorders>
               <w:top w:val="single" w:sz="4" w:color="000000"/>
               <w:left w:val="none" w:sz="0" w:color="FFFFFF"/>
@@ -4082,7 +4082,7 @@
         </w:trPr>
         <w:tc>
           <w:tcPr>
-            <w:tcW w:type="dxa" w:w="1893"/>
+            <w:tcW w:type="dxa" w:w="1897"/>
             <w:tcBorders>
               <w:top w:val="none" w:sz="0" w:color="FFFFFF"/>
               <w:left w:val="none" w:sz="0" w:color="FFFFFF"/>
@@ -4112,7 +4112,7 @@
         </w:tc>
         <w:tc>
           <w:tcPr>
-            <w:tcW w:type="dxa" w:w="1506"/>
+            <w:tcW w:type="dxa" w:w="1507"/>
             <w:tcBorders>
               <w:top w:val="none" w:sz="0" w:color="FFFFFF"/>
               <w:left w:val="none" w:sz="0" w:color="FFFFFF"/>
@@ -4142,7 +4142,7 @@
         </w:tc>
         <w:tc>
           <w:tcPr>
-            <w:tcW w:type="dxa" w:w="4164"/>
+            <w:tcW w:type="dxa" w:w="4168"/>
             <w:tcBorders>
               <w:top w:val="none" w:sz="0" w:color="FFFFFF"/>
               <w:left w:val="none" w:sz="0" w:color="FFFFFF"/>
@@ -4172,31 +4172,31 @@
         </w:tc>
         <w:tc>
           <w:tcPr>
-            <w:tcW w:type="dxa" w:w="1797"/>
-            <w:tcBorders>
-              <w:top w:val="none" w:sz="0" w:color="FFFFFF"/>
-              <w:left w:val="none" w:sz="0" w:color="FFFFFF"/>
-              <w:bottom w:val="none" w:sz="0" w:color="FFFFFF"/>
-              <w:right w:val="none" w:sz="0" w:color="FFFFFF"/>
-            </w:tcBorders>
-            <w:tcMar>
-              <w:top w:w="40" w:type="dxa"/>
-              <w:left w:w="90" w:type="dxa"/>
-              <w:bottom w:w="40" w:type="dxa"/>
-              <w:right w:w="90" w:type="dxa"/>
-            </w:tcMar>
-          </w:tcPr>
-          <w:p>
-            <w:pPr>
-              <w:spacing w:before="0" w:after="0" w:line="360" w:lineRule="auto"/>
-              <w:jc w:val="left"/>
-            </w:pPr>
-            <w:r>
-              <w:rPr>
-                <w:b w:val="0"/>
-                <w:sz w:val="18"/>
-              </w:rPr>
-              <w:t>Configurado y compilado</w:t>
+            <w:tcW w:type="dxa" w:w="1788"/>
+            <w:tcBorders>
+              <w:top w:val="none" w:sz="0" w:color="FFFFFF"/>
+              <w:left w:val="none" w:sz="0" w:color="FFFFFF"/>
+              <w:bottom w:val="none" w:sz="0" w:color="FFFFFF"/>
+              <w:right w:val="none" w:sz="0" w:color="FFFFFF"/>
+            </w:tcBorders>
+            <w:tcMar>
+              <w:top w:w="40" w:type="dxa"/>
+              <w:left w:w="90" w:type="dxa"/>
+              <w:bottom w:w="40" w:type="dxa"/>
+              <w:right w:w="90" w:type="dxa"/>
+            </w:tcMar>
+          </w:tcPr>
+          <w:p>
+            <w:pPr>
+              <w:spacing w:before="0" w:after="0" w:line="360" w:lineRule="auto"/>
+              <w:jc w:val="left"/>
+            </w:pPr>
+            <w:r>
+              <w:rPr>
+                <w:b w:val="0"/>
+                <w:sz w:val="18"/>
+              </w:rPr>
+              <w:t>Configurado (bloque 3)</w:t>
             </w:r>
           </w:p>
         </w:tc>
@@ -4207,7 +4207,7 @@
         </w:trPr>
         <w:tc>
           <w:tcPr>
-            <w:tcW w:type="dxa" w:w="1893"/>
+            <w:tcW w:type="dxa" w:w="1897"/>
             <w:tcBorders>
               <w:top w:val="none" w:sz="0" w:color="FFFFFF"/>
               <w:left w:val="none" w:sz="0" w:color="FFFFFF"/>
@@ -4237,7 +4237,7 @@
         </w:tc>
         <w:tc>
           <w:tcPr>
-            <w:tcW w:type="dxa" w:w="1506"/>
+            <w:tcW w:type="dxa" w:w="1507"/>
             <w:tcBorders>
               <w:top w:val="none" w:sz="0" w:color="FFFFFF"/>
               <w:left w:val="none" w:sz="0" w:color="FFFFFF"/>
@@ -4267,7 +4267,7 @@
         </w:tc>
         <w:tc>
           <w:tcPr>
-            <w:tcW w:type="dxa" w:w="4164"/>
+            <w:tcW w:type="dxa" w:w="4168"/>
             <w:tcBorders>
               <w:top w:val="none" w:sz="0" w:color="FFFFFF"/>
               <w:left w:val="none" w:sz="0" w:color="FFFFFF"/>
@@ -4297,31 +4297,31 @@
         </w:tc>
         <w:tc>
           <w:tcPr>
-            <w:tcW w:type="dxa" w:w="1797"/>
-            <w:tcBorders>
-              <w:top w:val="none" w:sz="0" w:color="FFFFFF"/>
-              <w:left w:val="none" w:sz="0" w:color="FFFFFF"/>
-              <w:bottom w:val="none" w:sz="0" w:color="FFFFFF"/>
-              <w:right w:val="none" w:sz="0" w:color="FFFFFF"/>
-            </w:tcBorders>
-            <w:tcMar>
-              <w:top w:w="40" w:type="dxa"/>
-              <w:left w:w="90" w:type="dxa"/>
-              <w:bottom w:w="40" w:type="dxa"/>
-              <w:right w:w="90" w:type="dxa"/>
-            </w:tcMar>
-          </w:tcPr>
-          <w:p>
-            <w:pPr>
-              <w:spacing w:before="0" w:after="0" w:line="360" w:lineRule="auto"/>
-              <w:jc w:val="left"/>
-            </w:pPr>
-            <w:r>
-              <w:rPr>
-                <w:b w:val="0"/>
-                <w:sz w:val="18"/>
-              </w:rPr>
-              <w:t>Configurado y compilado</w:t>
+            <w:tcW w:type="dxa" w:w="1788"/>
+            <w:tcBorders>
+              <w:top w:val="none" w:sz="0" w:color="FFFFFF"/>
+              <w:left w:val="none" w:sz="0" w:color="FFFFFF"/>
+              <w:bottom w:val="none" w:sz="0" w:color="FFFFFF"/>
+              <w:right w:val="none" w:sz="0" w:color="FFFFFF"/>
+            </w:tcBorders>
+            <w:tcMar>
+              <w:top w:w="40" w:type="dxa"/>
+              <w:left w:w="90" w:type="dxa"/>
+              <w:bottom w:w="40" w:type="dxa"/>
+              <w:right w:w="90" w:type="dxa"/>
+            </w:tcMar>
+          </w:tcPr>
+          <w:p>
+            <w:pPr>
+              <w:spacing w:before="0" w:after="0" w:line="360" w:lineRule="auto"/>
+              <w:jc w:val="left"/>
+            </w:pPr>
+            <w:r>
+              <w:rPr>
+                <w:b w:val="0"/>
+                <w:sz w:val="18"/>
+              </w:rPr>
+              <w:t>Configurado (bloque 3)</w:t>
             </w:r>
           </w:p>
         </w:tc>
@@ -4332,7 +4332,7 @@
         </w:trPr>
         <w:tc>
           <w:tcPr>
-            <w:tcW w:type="dxa" w:w="1893"/>
+            <w:tcW w:type="dxa" w:w="1897"/>
             <w:tcBorders>
               <w:top w:val="none" w:sz="0" w:color="FFFFFF"/>
               <w:left w:val="none" w:sz="0" w:color="FFFFFF"/>
@@ -4362,7 +4362,7 @@
         </w:tc>
         <w:tc>
           <w:tcPr>
-            <w:tcW w:type="dxa" w:w="1506"/>
+            <w:tcW w:type="dxa" w:w="1507"/>
             <w:tcBorders>
               <w:top w:val="none" w:sz="0" w:color="FFFFFF"/>
               <w:left w:val="none" w:sz="0" w:color="FFFFFF"/>
@@ -4392,7 +4392,7 @@
         </w:tc>
         <w:tc>
           <w:tcPr>
-            <w:tcW w:type="dxa" w:w="4164"/>
+            <w:tcW w:type="dxa" w:w="4168"/>
             <w:tcBorders>
               <w:top w:val="none" w:sz="0" w:color="FFFFFF"/>
               <w:left w:val="none" w:sz="0" w:color="FFFFFF"/>
@@ -4422,31 +4422,31 @@
         </w:tc>
         <w:tc>
           <w:tcPr>
-            <w:tcW w:type="dxa" w:w="1797"/>
-            <w:tcBorders>
-              <w:top w:val="none" w:sz="0" w:color="FFFFFF"/>
-              <w:left w:val="none" w:sz="0" w:color="FFFFFF"/>
-              <w:bottom w:val="none" w:sz="0" w:color="FFFFFF"/>
-              <w:right w:val="none" w:sz="0" w:color="FFFFFF"/>
-            </w:tcBorders>
-            <w:tcMar>
-              <w:top w:w="40" w:type="dxa"/>
-              <w:left w:w="90" w:type="dxa"/>
-              <w:bottom w:w="40" w:type="dxa"/>
-              <w:right w:w="90" w:type="dxa"/>
-            </w:tcMar>
-          </w:tcPr>
-          <w:p>
-            <w:pPr>
-              <w:spacing w:before="0" w:after="0" w:line="360" w:lineRule="auto"/>
-              <w:jc w:val="left"/>
-            </w:pPr>
-            <w:r>
-              <w:rPr>
-                <w:b w:val="0"/>
-                <w:sz w:val="18"/>
-              </w:rPr>
-              <w:t>Configurado y compilado</w:t>
+            <w:tcW w:type="dxa" w:w="1788"/>
+            <w:tcBorders>
+              <w:top w:val="none" w:sz="0" w:color="FFFFFF"/>
+              <w:left w:val="none" w:sz="0" w:color="FFFFFF"/>
+              <w:bottom w:val="none" w:sz="0" w:color="FFFFFF"/>
+              <w:right w:val="none" w:sz="0" w:color="FFFFFF"/>
+            </w:tcBorders>
+            <w:tcMar>
+              <w:top w:w="40" w:type="dxa"/>
+              <w:left w:w="90" w:type="dxa"/>
+              <w:bottom w:w="40" w:type="dxa"/>
+              <w:right w:w="90" w:type="dxa"/>
+            </w:tcMar>
+          </w:tcPr>
+          <w:p>
+            <w:pPr>
+              <w:spacing w:before="0" w:after="0" w:line="360" w:lineRule="auto"/>
+              <w:jc w:val="left"/>
+            </w:pPr>
+            <w:r>
+              <w:rPr>
+                <w:b w:val="0"/>
+                <w:sz w:val="18"/>
+              </w:rPr>
+              <w:t>Configurado (bloque 3)</w:t>
             </w:r>
           </w:p>
         </w:tc>
@@ -4457,7 +4457,7 @@
         </w:trPr>
         <w:tc>
           <w:tcPr>
-            <w:tcW w:type="dxa" w:w="1893"/>
+            <w:tcW w:type="dxa" w:w="1897"/>
             <w:tcBorders>
               <w:top w:val="none" w:sz="0" w:color="FFFFFF"/>
               <w:left w:val="none" w:sz="0" w:color="FFFFFF"/>
@@ -4487,7 +4487,7 @@
         </w:tc>
         <w:tc>
           <w:tcPr>
-            <w:tcW w:type="dxa" w:w="1506"/>
+            <w:tcW w:type="dxa" w:w="1507"/>
             <w:tcBorders>
               <w:top w:val="none" w:sz="0" w:color="FFFFFF"/>
               <w:left w:val="none" w:sz="0" w:color="FFFFFF"/>
@@ -4517,7 +4517,7 @@
         </w:tc>
         <w:tc>
           <w:tcPr>
-            <w:tcW w:type="dxa" w:w="4164"/>
+            <w:tcW w:type="dxa" w:w="4168"/>
             <w:tcBorders>
               <w:top w:val="none" w:sz="0" w:color="FFFFFF"/>
               <w:left w:val="none" w:sz="0" w:color="FFFFFF"/>
@@ -4547,31 +4547,31 @@
         </w:tc>
         <w:tc>
           <w:tcPr>
-            <w:tcW w:type="dxa" w:w="1797"/>
-            <w:tcBorders>
-              <w:top w:val="none" w:sz="0" w:color="FFFFFF"/>
-              <w:left w:val="none" w:sz="0" w:color="FFFFFF"/>
-              <w:bottom w:val="none" w:sz="0" w:color="FFFFFF"/>
-              <w:right w:val="none" w:sz="0" w:color="FFFFFF"/>
-            </w:tcBorders>
-            <w:tcMar>
-              <w:top w:w="40" w:type="dxa"/>
-              <w:left w:w="90" w:type="dxa"/>
-              <w:bottom w:w="40" w:type="dxa"/>
-              <w:right w:w="90" w:type="dxa"/>
-            </w:tcMar>
-          </w:tcPr>
-          <w:p>
-            <w:pPr>
-              <w:spacing w:before="0" w:after="0" w:line="360" w:lineRule="auto"/>
-              <w:jc w:val="left"/>
-            </w:pPr>
-            <w:r>
-              <w:rPr>
-                <w:b w:val="0"/>
-                <w:sz w:val="18"/>
-              </w:rPr>
-              <w:t>Configurado y compilado</w:t>
+            <w:tcW w:type="dxa" w:w="1788"/>
+            <w:tcBorders>
+              <w:top w:val="none" w:sz="0" w:color="FFFFFF"/>
+              <w:left w:val="none" w:sz="0" w:color="FFFFFF"/>
+              <w:bottom w:val="none" w:sz="0" w:color="FFFFFF"/>
+              <w:right w:val="none" w:sz="0" w:color="FFFFFF"/>
+            </w:tcBorders>
+            <w:tcMar>
+              <w:top w:w="40" w:type="dxa"/>
+              <w:left w:w="90" w:type="dxa"/>
+              <w:bottom w:w="40" w:type="dxa"/>
+              <w:right w:w="90" w:type="dxa"/>
+            </w:tcMar>
+          </w:tcPr>
+          <w:p>
+            <w:pPr>
+              <w:spacing w:before="0" w:after="0" w:line="360" w:lineRule="auto"/>
+              <w:jc w:val="left"/>
+            </w:pPr>
+            <w:r>
+              <w:rPr>
+                <w:b w:val="0"/>
+                <w:sz w:val="18"/>
+              </w:rPr>
+              <w:t>Configurado (bloque 3)</w:t>
             </w:r>
           </w:p>
         </w:tc>
@@ -4582,7 +4582,7 @@
         </w:trPr>
         <w:tc>
           <w:tcPr>
-            <w:tcW w:type="dxa" w:w="1893"/>
+            <w:tcW w:type="dxa" w:w="1897"/>
             <w:tcBorders>
               <w:top w:val="none" w:sz="0" w:color="FFFFFF"/>
               <w:left w:val="none" w:sz="0" w:color="FFFFFF"/>
@@ -4612,7 +4612,7 @@
         </w:tc>
         <w:tc>
           <w:tcPr>
-            <w:tcW w:type="dxa" w:w="1506"/>
+            <w:tcW w:type="dxa" w:w="1507"/>
             <w:tcBorders>
               <w:top w:val="none" w:sz="0" w:color="FFFFFF"/>
               <w:left w:val="none" w:sz="0" w:color="FFFFFF"/>
@@ -4642,7 +4642,7 @@
         </w:tc>
         <w:tc>
           <w:tcPr>
-            <w:tcW w:type="dxa" w:w="4164"/>
+            <w:tcW w:type="dxa" w:w="4168"/>
             <w:tcBorders>
               <w:top w:val="none" w:sz="0" w:color="FFFFFF"/>
               <w:left w:val="none" w:sz="0" w:color="FFFFFF"/>
@@ -4672,7 +4672,7 @@
         </w:tc>
         <w:tc>
           <w:tcPr>
-            <w:tcW w:type="dxa" w:w="1797"/>
+            <w:tcW w:type="dxa" w:w="1788"/>
             <w:tcBorders>
               <w:top w:val="none" w:sz="0" w:color="FFFFFF"/>
               <w:left w:val="none" w:sz="0" w:color="FFFFFF"/>
@@ -4707,7 +4707,7 @@
         </w:trPr>
         <w:tc>
           <w:tcPr>
-            <w:tcW w:type="dxa" w:w="1893"/>
+            <w:tcW w:type="dxa" w:w="1897"/>
             <w:tcBorders>
               <w:top w:val="none" w:sz="0" w:color="FFFFFF"/>
               <w:left w:val="none" w:sz="0" w:color="FFFFFF"/>
@@ -4737,7 +4737,7 @@
         </w:tc>
         <w:tc>
           <w:tcPr>
-            <w:tcW w:type="dxa" w:w="1506"/>
+            <w:tcW w:type="dxa" w:w="1507"/>
             <w:tcBorders>
               <w:top w:val="none" w:sz="0" w:color="FFFFFF"/>
               <w:left w:val="none" w:sz="0" w:color="FFFFFF"/>
@@ -4767,7 +4767,7 @@
         </w:tc>
         <w:tc>
           <w:tcPr>
-            <w:tcW w:type="dxa" w:w="4164"/>
+            <w:tcW w:type="dxa" w:w="4168"/>
             <w:tcBorders>
               <w:top w:val="none" w:sz="0" w:color="FFFFFF"/>
               <w:left w:val="none" w:sz="0" w:color="FFFFFF"/>
@@ -4797,7 +4797,7 @@
         </w:tc>
         <w:tc>
           <w:tcPr>
-            <w:tcW w:type="dxa" w:w="1797"/>
+            <w:tcW w:type="dxa" w:w="1788"/>
             <w:tcBorders>
               <w:top w:val="none" w:sz="0" w:color="FFFFFF"/>
               <w:left w:val="none" w:sz="0" w:color="FFFFFF"/>
@@ -4832,7 +4832,7 @@
         </w:trPr>
         <w:tc>
           <w:tcPr>
-            <w:tcW w:type="dxa" w:w="1893"/>
+            <w:tcW w:type="dxa" w:w="1897"/>
             <w:tcBorders>
               <w:top w:val="none" w:sz="0" w:color="FFFFFF"/>
               <w:left w:val="none" w:sz="0" w:color="FFFFFF"/>
@@ -4862,7 +4862,7 @@
         </w:tc>
         <w:tc>
           <w:tcPr>
-            <w:tcW w:type="dxa" w:w="1506"/>
+            <w:tcW w:type="dxa" w:w="1507"/>
             <w:tcBorders>
               <w:top w:val="none" w:sz="0" w:color="FFFFFF"/>
               <w:left w:val="none" w:sz="0" w:color="FFFFFF"/>
@@ -4892,7 +4892,7 @@
         </w:tc>
         <w:tc>
           <w:tcPr>
-            <w:tcW w:type="dxa" w:w="4164"/>
+            <w:tcW w:type="dxa" w:w="4168"/>
             <w:tcBorders>
               <w:top w:val="none" w:sz="0" w:color="FFFFFF"/>
               <w:left w:val="none" w:sz="0" w:color="FFFFFF"/>
@@ -4922,7 +4922,7 @@
         </w:tc>
         <w:tc>
           <w:tcPr>
-            <w:tcW w:type="dxa" w:w="1797"/>
+            <w:tcW w:type="dxa" w:w="1788"/>
             <w:tcBorders>
               <w:top w:val="none" w:sz="0" w:color="FFFFFF"/>
               <w:left w:val="none" w:sz="0" w:color="FFFFFF"/>
@@ -4957,7 +4957,7 @@
         </w:trPr>
         <w:tc>
           <w:tcPr>
-            <w:tcW w:type="dxa" w:w="1893"/>
+            <w:tcW w:type="dxa" w:w="1897"/>
             <w:tcBorders>
               <w:top w:val="none" w:sz="0" w:color="FFFFFF"/>
               <w:left w:val="none" w:sz="0" w:color="FFFFFF"/>
@@ -4987,7 +4987,7 @@
         </w:tc>
         <w:tc>
           <w:tcPr>
-            <w:tcW w:type="dxa" w:w="1506"/>
+            <w:tcW w:type="dxa" w:w="1507"/>
             <w:tcBorders>
               <w:top w:val="none" w:sz="0" w:color="FFFFFF"/>
               <w:left w:val="none" w:sz="0" w:color="FFFFFF"/>
@@ -5017,7 +5017,7 @@
         </w:tc>
         <w:tc>
           <w:tcPr>
-            <w:tcW w:type="dxa" w:w="4164"/>
+            <w:tcW w:type="dxa" w:w="4168"/>
             <w:tcBorders>
               <w:top w:val="none" w:sz="0" w:color="FFFFFF"/>
               <w:left w:val="none" w:sz="0" w:color="FFFFFF"/>
@@ -5047,7 +5047,7 @@
         </w:tc>
         <w:tc>
           <w:tcPr>
-            <w:tcW w:type="dxa" w:w="1797"/>
+            <w:tcW w:type="dxa" w:w="1788"/>
             <w:tcBorders>
               <w:top w:val="none" w:sz="0" w:color="FFFFFF"/>
               <w:left w:val="none" w:sz="0" w:color="FFFFFF"/>
@@ -5082,7 +5082,7 @@
         </w:trPr>
         <w:tc>
           <w:tcPr>
-            <w:tcW w:type="dxa" w:w="1893"/>
+            <w:tcW w:type="dxa" w:w="1897"/>
             <w:tcBorders>
               <w:top w:val="none" w:sz="0" w:color="FFFFFF"/>
               <w:left w:val="none" w:sz="0" w:color="FFFFFF"/>
@@ -5112,7 +5112,7 @@
         </w:tc>
         <w:tc>
           <w:tcPr>
-            <w:tcW w:type="dxa" w:w="1506"/>
+            <w:tcW w:type="dxa" w:w="1507"/>
             <w:tcBorders>
               <w:top w:val="none" w:sz="0" w:color="FFFFFF"/>
               <w:left w:val="none" w:sz="0" w:color="FFFFFF"/>
@@ -5142,7 +5142,7 @@
         </w:tc>
         <w:tc>
           <w:tcPr>
-            <w:tcW w:type="dxa" w:w="4164"/>
+            <w:tcW w:type="dxa" w:w="4168"/>
             <w:tcBorders>
               <w:top w:val="none" w:sz="0" w:color="FFFFFF"/>
               <w:left w:val="none" w:sz="0" w:color="FFFFFF"/>
@@ -5172,7 +5172,7 @@
         </w:tc>
         <w:tc>
           <w:tcPr>
-            <w:tcW w:type="dxa" w:w="1797"/>
+            <w:tcW w:type="dxa" w:w="1788"/>
             <w:tcBorders>
               <w:top w:val="none" w:sz="0" w:color="FFFFFF"/>
               <w:left w:val="none" w:sz="0" w:color="FFFFFF"/>
@@ -5207,7 +5207,7 @@
         </w:trPr>
         <w:tc>
           <w:tcPr>
-            <w:tcW w:type="dxa" w:w="1893"/>
+            <w:tcW w:type="dxa" w:w="1897"/>
             <w:tcBorders>
               <w:top w:val="none" w:sz="0" w:color="FFFFFF"/>
               <w:left w:val="none" w:sz="0" w:color="FFFFFF"/>
@@ -5237,7 +5237,7 @@
         </w:tc>
         <w:tc>
           <w:tcPr>
-            <w:tcW w:type="dxa" w:w="1506"/>
+            <w:tcW w:type="dxa" w:w="1507"/>
             <w:tcBorders>
               <w:top w:val="none" w:sz="0" w:color="FFFFFF"/>
               <w:left w:val="none" w:sz="0" w:color="FFFFFF"/>
@@ -5267,7 +5267,7 @@
         </w:tc>
         <w:tc>
           <w:tcPr>
-            <w:tcW w:type="dxa" w:w="4164"/>
+            <w:tcW w:type="dxa" w:w="4168"/>
             <w:tcBorders>
               <w:top w:val="none" w:sz="0" w:color="FFFFFF"/>
               <w:left w:val="none" w:sz="0" w:color="FFFFFF"/>
@@ -5297,7 +5297,7 @@
         </w:tc>
         <w:tc>
           <w:tcPr>
-            <w:tcW w:type="dxa" w:w="1797"/>
+            <w:tcW w:type="dxa" w:w="1788"/>
             <w:tcBorders>
               <w:top w:val="none" w:sz="0" w:color="FFFFFF"/>
               <w:left w:val="none" w:sz="0" w:color="FFFFFF"/>
@@ -5332,7 +5332,7 @@
         </w:trPr>
         <w:tc>
           <w:tcPr>
-            <w:tcW w:type="dxa" w:w="1893"/>
+            <w:tcW w:type="dxa" w:w="1897"/>
             <w:tcBorders>
               <w:top w:val="none" w:sz="0" w:color="FFFFFF"/>
               <w:left w:val="none" w:sz="0" w:color="FFFFFF"/>
@@ -5362,7 +5362,7 @@
         </w:tc>
         <w:tc>
           <w:tcPr>
-            <w:tcW w:type="dxa" w:w="1506"/>
+            <w:tcW w:type="dxa" w:w="1507"/>
             <w:tcBorders>
               <w:top w:val="none" w:sz="0" w:color="FFFFFF"/>
               <w:left w:val="none" w:sz="0" w:color="FFFFFF"/>
@@ -5392,7 +5392,7 @@
         </w:tc>
         <w:tc>
           <w:tcPr>
-            <w:tcW w:type="dxa" w:w="4164"/>
+            <w:tcW w:type="dxa" w:w="4168"/>
             <w:tcBorders>
               <w:top w:val="none" w:sz="0" w:color="FFFFFF"/>
               <w:left w:val="none" w:sz="0" w:color="FFFFFF"/>
@@ -5422,7 +5422,7 @@
         </w:tc>
         <w:tc>
           <w:tcPr>
-            <w:tcW w:type="dxa" w:w="1797"/>
+            <w:tcW w:type="dxa" w:w="1788"/>
             <w:tcBorders>
               <w:top w:val="none" w:sz="0" w:color="FFFFFF"/>
               <w:left w:val="none" w:sz="0" w:color="FFFFFF"/>
@@ -5457,7 +5457,7 @@
         </w:trPr>
         <w:tc>
           <w:tcPr>
-            <w:tcW w:type="dxa" w:w="1893"/>
+            <w:tcW w:type="dxa" w:w="1897"/>
             <w:tcBorders>
               <w:top w:val="none" w:sz="0" w:color="FFFFFF"/>
               <w:left w:val="none" w:sz="0" w:color="FFFFFF"/>
@@ -5487,7 +5487,7 @@
         </w:tc>
         <w:tc>
           <w:tcPr>
-            <w:tcW w:type="dxa" w:w="1506"/>
+            <w:tcW w:type="dxa" w:w="1507"/>
             <w:tcBorders>
               <w:top w:val="none" w:sz="0" w:color="FFFFFF"/>
               <w:left w:val="none" w:sz="0" w:color="FFFFFF"/>
@@ -5517,7 +5517,7 @@
         </w:tc>
         <w:tc>
           <w:tcPr>
-            <w:tcW w:type="dxa" w:w="4164"/>
+            <w:tcW w:type="dxa" w:w="4168"/>
             <w:tcBorders>
               <w:top w:val="none" w:sz="0" w:color="FFFFFF"/>
               <w:left w:val="none" w:sz="0" w:color="FFFFFF"/>
@@ -5547,7 +5547,7 @@
         </w:tc>
         <w:tc>
           <w:tcPr>
-            <w:tcW w:type="dxa" w:w="1797"/>
+            <w:tcW w:type="dxa" w:w="1788"/>
             <w:tcBorders>
               <w:top w:val="none" w:sz="0" w:color="FFFFFF"/>
               <w:left w:val="none" w:sz="0" w:color="FFFFFF"/>
@@ -5593,7 +5593,7 @@
         <w:rPr>
           <w:sz w:val="24"/>
         </w:rPr>
-        <w:t>MASVS = OWASP Mobile Application Security Verification Standard 2.1.0. Lo configurado en el bloque 3 se aplica al generar el proyecto nativo; el 30 de octubre compilamos la versión de release con esa configuración y la app abrió en el emulador (EVD-3-17). El análisis del APK con MobSF queda para la Fase 4 (EVD-3-07).</w:t>
+        <w:t>MASVS = OWASP Mobile Application Security Verification Standard 2.1.0. Lo configurado en el bloque 3 se aplica al generar el proyecto nativo; falta comprobarlo con una compilación de release (EVD-3-17) y con MobSF en la Fase 4 (EVD-3-07).</w:t>
       </w:r>
     </w:p>
     <w:p>

</xml_diff>

<commit_message>
docs: build de release validado desde la rama del bloque 3 (EVD-3-17)
Co-Authored-By: Claude Opus 5.5 <noreply@anthropic.com>
Claude-Session: https://claude.ai/code/session_017At5jrBqssTLVLpHCxyjLn
</commit_message>
<xml_diff>
--- a/docs/entregas/Final_Secciones_3-4_3-5_4-3_4-4_4-6_DevSecOps.docx
+++ b/docs/entregas/Final_Secciones_3-4_3-5_4-3_4-4_4-6_DevSecOps.docx
@@ -3945,10 +3945,10 @@
         <w:tblLook w:firstColumn="1" w:firstRow="1" w:lastColumn="0" w:lastRow="0" w:noHBand="0" w:noVBand="1" w:val="04A0"/>
       </w:tblPr>
       <w:tblGrid>
-        <w:gridCol w:w="1897"/>
-        <w:gridCol w:w="1507"/>
-        <w:gridCol w:w="4167"/>
-        <w:gridCol w:w="1787"/>
+        <w:gridCol w:w="1885"/>
+        <w:gridCol w:w="1503"/>
+        <w:gridCol w:w="4156"/>
+        <w:gridCol w:w="1813"/>
       </w:tblGrid>
       <w:tr>
         <w:trPr>
@@ -3957,7 +3957,7 @@
         </w:trPr>
         <w:tc>
           <w:tcPr>
-            <w:tcW w:type="dxa" w:w="1897"/>
+            <w:tcW w:type="dxa" w:w="1886"/>
             <w:tcBorders>
               <w:top w:val="single" w:sz="4" w:color="000000"/>
               <w:left w:val="none" w:sz="0" w:color="FFFFFF"/>
@@ -3987,7 +3987,7 @@
         </w:tc>
         <w:tc>
           <w:tcPr>
-            <w:tcW w:type="dxa" w:w="1507"/>
+            <w:tcW w:type="dxa" w:w="1504"/>
             <w:tcBorders>
               <w:top w:val="single" w:sz="4" w:color="000000"/>
               <w:left w:val="none" w:sz="0" w:color="FFFFFF"/>
@@ -4017,7 +4017,7 @@
         </w:tc>
         <w:tc>
           <w:tcPr>
-            <w:tcW w:type="dxa" w:w="4168"/>
+            <w:tcW w:type="dxa" w:w="4157"/>
             <w:tcBorders>
               <w:top w:val="single" w:sz="4" w:color="000000"/>
               <w:left w:val="none" w:sz="0" w:color="FFFFFF"/>
@@ -4047,7 +4047,7 @@
         </w:tc>
         <w:tc>
           <w:tcPr>
-            <w:tcW w:type="dxa" w:w="1788"/>
+            <w:tcW w:type="dxa" w:w="1813"/>
             <w:tcBorders>
               <w:top w:val="single" w:sz="4" w:color="000000"/>
               <w:left w:val="none" w:sz="0" w:color="FFFFFF"/>
@@ -4082,7 +4082,7 @@
         </w:trPr>
         <w:tc>
           <w:tcPr>
-            <w:tcW w:type="dxa" w:w="1897"/>
+            <w:tcW w:type="dxa" w:w="1886"/>
             <w:tcBorders>
               <w:top w:val="none" w:sz="0" w:color="FFFFFF"/>
               <w:left w:val="none" w:sz="0" w:color="FFFFFF"/>
@@ -4112,7 +4112,7 @@
         </w:tc>
         <w:tc>
           <w:tcPr>
-            <w:tcW w:type="dxa" w:w="1507"/>
+            <w:tcW w:type="dxa" w:w="1504"/>
             <w:tcBorders>
               <w:top w:val="none" w:sz="0" w:color="FFFFFF"/>
               <w:left w:val="none" w:sz="0" w:color="FFFFFF"/>
@@ -4142,7 +4142,7 @@
         </w:tc>
         <w:tc>
           <w:tcPr>
-            <w:tcW w:type="dxa" w:w="4168"/>
+            <w:tcW w:type="dxa" w:w="4157"/>
             <w:tcBorders>
               <w:top w:val="none" w:sz="0" w:color="FFFFFF"/>
               <w:left w:val="none" w:sz="0" w:color="FFFFFF"/>
@@ -4172,31 +4172,31 @@
         </w:tc>
         <w:tc>
           <w:tcPr>
-            <w:tcW w:type="dxa" w:w="1788"/>
-            <w:tcBorders>
-              <w:top w:val="none" w:sz="0" w:color="FFFFFF"/>
-              <w:left w:val="none" w:sz="0" w:color="FFFFFF"/>
-              <w:bottom w:val="none" w:sz="0" w:color="FFFFFF"/>
-              <w:right w:val="none" w:sz="0" w:color="FFFFFF"/>
-            </w:tcBorders>
-            <w:tcMar>
-              <w:top w:w="40" w:type="dxa"/>
-              <w:left w:w="90" w:type="dxa"/>
-              <w:bottom w:w="40" w:type="dxa"/>
-              <w:right w:w="90" w:type="dxa"/>
-            </w:tcMar>
-          </w:tcPr>
-          <w:p>
-            <w:pPr>
-              <w:spacing w:before="0" w:after="0" w:line="360" w:lineRule="auto"/>
-              <w:jc w:val="left"/>
-            </w:pPr>
-            <w:r>
-              <w:rPr>
-                <w:b w:val="0"/>
-                <w:sz w:val="18"/>
-              </w:rPr>
-              <w:t>Configurado (bloque 3)</w:t>
+            <w:tcW w:type="dxa" w:w="1813"/>
+            <w:tcBorders>
+              <w:top w:val="none" w:sz="0" w:color="FFFFFF"/>
+              <w:left w:val="none" w:sz="0" w:color="FFFFFF"/>
+              <w:bottom w:val="none" w:sz="0" w:color="FFFFFF"/>
+              <w:right w:val="none" w:sz="0" w:color="FFFFFF"/>
+            </w:tcBorders>
+            <w:tcMar>
+              <w:top w:w="40" w:type="dxa"/>
+              <w:left w:w="90" w:type="dxa"/>
+              <w:bottom w:w="40" w:type="dxa"/>
+              <w:right w:w="90" w:type="dxa"/>
+            </w:tcMar>
+          </w:tcPr>
+          <w:p>
+            <w:pPr>
+              <w:spacing w:before="0" w:after="0" w:line="360" w:lineRule="auto"/>
+              <w:jc w:val="left"/>
+            </w:pPr>
+            <w:r>
+              <w:rPr>
+                <w:b w:val="0"/>
+                <w:sz w:val="18"/>
+              </w:rPr>
+              <w:t>Configurado y compilado</w:t>
             </w:r>
           </w:p>
         </w:tc>
@@ -4207,7 +4207,7 @@
         </w:trPr>
         <w:tc>
           <w:tcPr>
-            <w:tcW w:type="dxa" w:w="1897"/>
+            <w:tcW w:type="dxa" w:w="1886"/>
             <w:tcBorders>
               <w:top w:val="none" w:sz="0" w:color="FFFFFF"/>
               <w:left w:val="none" w:sz="0" w:color="FFFFFF"/>
@@ -4237,7 +4237,7 @@
         </w:tc>
         <w:tc>
           <w:tcPr>
-            <w:tcW w:type="dxa" w:w="1507"/>
+            <w:tcW w:type="dxa" w:w="1504"/>
             <w:tcBorders>
               <w:top w:val="none" w:sz="0" w:color="FFFFFF"/>
               <w:left w:val="none" w:sz="0" w:color="FFFFFF"/>
@@ -4267,7 +4267,7 @@
         </w:tc>
         <w:tc>
           <w:tcPr>
-            <w:tcW w:type="dxa" w:w="4168"/>
+            <w:tcW w:type="dxa" w:w="4157"/>
             <w:tcBorders>
               <w:top w:val="none" w:sz="0" w:color="FFFFFF"/>
               <w:left w:val="none" w:sz="0" w:color="FFFFFF"/>
@@ -4297,31 +4297,31 @@
         </w:tc>
         <w:tc>
           <w:tcPr>
-            <w:tcW w:type="dxa" w:w="1788"/>
-            <w:tcBorders>
-              <w:top w:val="none" w:sz="0" w:color="FFFFFF"/>
-              <w:left w:val="none" w:sz="0" w:color="FFFFFF"/>
-              <w:bottom w:val="none" w:sz="0" w:color="FFFFFF"/>
-              <w:right w:val="none" w:sz="0" w:color="FFFFFF"/>
-            </w:tcBorders>
-            <w:tcMar>
-              <w:top w:w="40" w:type="dxa"/>
-              <w:left w:w="90" w:type="dxa"/>
-              <w:bottom w:w="40" w:type="dxa"/>
-              <w:right w:w="90" w:type="dxa"/>
-            </w:tcMar>
-          </w:tcPr>
-          <w:p>
-            <w:pPr>
-              <w:spacing w:before="0" w:after="0" w:line="360" w:lineRule="auto"/>
-              <w:jc w:val="left"/>
-            </w:pPr>
-            <w:r>
-              <w:rPr>
-                <w:b w:val="0"/>
-                <w:sz w:val="18"/>
-              </w:rPr>
-              <w:t>Configurado (bloque 3)</w:t>
+            <w:tcW w:type="dxa" w:w="1813"/>
+            <w:tcBorders>
+              <w:top w:val="none" w:sz="0" w:color="FFFFFF"/>
+              <w:left w:val="none" w:sz="0" w:color="FFFFFF"/>
+              <w:bottom w:val="none" w:sz="0" w:color="FFFFFF"/>
+              <w:right w:val="none" w:sz="0" w:color="FFFFFF"/>
+            </w:tcBorders>
+            <w:tcMar>
+              <w:top w:w="40" w:type="dxa"/>
+              <w:left w:w="90" w:type="dxa"/>
+              <w:bottom w:w="40" w:type="dxa"/>
+              <w:right w:w="90" w:type="dxa"/>
+            </w:tcMar>
+          </w:tcPr>
+          <w:p>
+            <w:pPr>
+              <w:spacing w:before="0" w:after="0" w:line="360" w:lineRule="auto"/>
+              <w:jc w:val="left"/>
+            </w:pPr>
+            <w:r>
+              <w:rPr>
+                <w:b w:val="0"/>
+                <w:sz w:val="18"/>
+              </w:rPr>
+              <w:t>Configurado y compilado</w:t>
             </w:r>
           </w:p>
         </w:tc>
@@ -4332,7 +4332,7 @@
         </w:trPr>
         <w:tc>
           <w:tcPr>
-            <w:tcW w:type="dxa" w:w="1897"/>
+            <w:tcW w:type="dxa" w:w="1886"/>
             <w:tcBorders>
               <w:top w:val="none" w:sz="0" w:color="FFFFFF"/>
               <w:left w:val="none" w:sz="0" w:color="FFFFFF"/>
@@ -4362,7 +4362,7 @@
         </w:tc>
         <w:tc>
           <w:tcPr>
-            <w:tcW w:type="dxa" w:w="1507"/>
+            <w:tcW w:type="dxa" w:w="1504"/>
             <w:tcBorders>
               <w:top w:val="none" w:sz="0" w:color="FFFFFF"/>
               <w:left w:val="none" w:sz="0" w:color="FFFFFF"/>
@@ -4392,7 +4392,7 @@
         </w:tc>
         <w:tc>
           <w:tcPr>
-            <w:tcW w:type="dxa" w:w="4168"/>
+            <w:tcW w:type="dxa" w:w="4157"/>
             <w:tcBorders>
               <w:top w:val="none" w:sz="0" w:color="FFFFFF"/>
               <w:left w:val="none" w:sz="0" w:color="FFFFFF"/>
@@ -4422,31 +4422,31 @@
         </w:tc>
         <w:tc>
           <w:tcPr>
-            <w:tcW w:type="dxa" w:w="1788"/>
-            <w:tcBorders>
-              <w:top w:val="none" w:sz="0" w:color="FFFFFF"/>
-              <w:left w:val="none" w:sz="0" w:color="FFFFFF"/>
-              <w:bottom w:val="none" w:sz="0" w:color="FFFFFF"/>
-              <w:right w:val="none" w:sz="0" w:color="FFFFFF"/>
-            </w:tcBorders>
-            <w:tcMar>
-              <w:top w:w="40" w:type="dxa"/>
-              <w:left w:w="90" w:type="dxa"/>
-              <w:bottom w:w="40" w:type="dxa"/>
-              <w:right w:w="90" w:type="dxa"/>
-            </w:tcMar>
-          </w:tcPr>
-          <w:p>
-            <w:pPr>
-              <w:spacing w:before="0" w:after="0" w:line="360" w:lineRule="auto"/>
-              <w:jc w:val="left"/>
-            </w:pPr>
-            <w:r>
-              <w:rPr>
-                <w:b w:val="0"/>
-                <w:sz w:val="18"/>
-              </w:rPr>
-              <w:t>Configurado (bloque 3)</w:t>
+            <w:tcW w:type="dxa" w:w="1813"/>
+            <w:tcBorders>
+              <w:top w:val="none" w:sz="0" w:color="FFFFFF"/>
+              <w:left w:val="none" w:sz="0" w:color="FFFFFF"/>
+              <w:bottom w:val="none" w:sz="0" w:color="FFFFFF"/>
+              <w:right w:val="none" w:sz="0" w:color="FFFFFF"/>
+            </w:tcBorders>
+            <w:tcMar>
+              <w:top w:w="40" w:type="dxa"/>
+              <w:left w:w="90" w:type="dxa"/>
+              <w:bottom w:w="40" w:type="dxa"/>
+              <w:right w:w="90" w:type="dxa"/>
+            </w:tcMar>
+          </w:tcPr>
+          <w:p>
+            <w:pPr>
+              <w:spacing w:before="0" w:after="0" w:line="360" w:lineRule="auto"/>
+              <w:jc w:val="left"/>
+            </w:pPr>
+            <w:r>
+              <w:rPr>
+                <w:b w:val="0"/>
+                <w:sz w:val="18"/>
+              </w:rPr>
+              <w:t>Configurado y compilado</w:t>
             </w:r>
           </w:p>
         </w:tc>
@@ -4457,7 +4457,7 @@
         </w:trPr>
         <w:tc>
           <w:tcPr>
-            <w:tcW w:type="dxa" w:w="1897"/>
+            <w:tcW w:type="dxa" w:w="1886"/>
             <w:tcBorders>
               <w:top w:val="none" w:sz="0" w:color="FFFFFF"/>
               <w:left w:val="none" w:sz="0" w:color="FFFFFF"/>
@@ -4487,7 +4487,7 @@
         </w:tc>
         <w:tc>
           <w:tcPr>
-            <w:tcW w:type="dxa" w:w="1507"/>
+            <w:tcW w:type="dxa" w:w="1504"/>
             <w:tcBorders>
               <w:top w:val="none" w:sz="0" w:color="FFFFFF"/>
               <w:left w:val="none" w:sz="0" w:color="FFFFFF"/>
@@ -4517,7 +4517,7 @@
         </w:tc>
         <w:tc>
           <w:tcPr>
-            <w:tcW w:type="dxa" w:w="4168"/>
+            <w:tcW w:type="dxa" w:w="4157"/>
             <w:tcBorders>
               <w:top w:val="none" w:sz="0" w:color="FFFFFF"/>
               <w:left w:val="none" w:sz="0" w:color="FFFFFF"/>
@@ -4547,31 +4547,31 @@
         </w:tc>
         <w:tc>
           <w:tcPr>
-            <w:tcW w:type="dxa" w:w="1788"/>
-            <w:tcBorders>
-              <w:top w:val="none" w:sz="0" w:color="FFFFFF"/>
-              <w:left w:val="none" w:sz="0" w:color="FFFFFF"/>
-              <w:bottom w:val="none" w:sz="0" w:color="FFFFFF"/>
-              <w:right w:val="none" w:sz="0" w:color="FFFFFF"/>
-            </w:tcBorders>
-            <w:tcMar>
-              <w:top w:w="40" w:type="dxa"/>
-              <w:left w:w="90" w:type="dxa"/>
-              <w:bottom w:w="40" w:type="dxa"/>
-              <w:right w:w="90" w:type="dxa"/>
-            </w:tcMar>
-          </w:tcPr>
-          <w:p>
-            <w:pPr>
-              <w:spacing w:before="0" w:after="0" w:line="360" w:lineRule="auto"/>
-              <w:jc w:val="left"/>
-            </w:pPr>
-            <w:r>
-              <w:rPr>
-                <w:b w:val="0"/>
-                <w:sz w:val="18"/>
-              </w:rPr>
-              <w:t>Configurado (bloque 3)</w:t>
+            <w:tcW w:type="dxa" w:w="1813"/>
+            <w:tcBorders>
+              <w:top w:val="none" w:sz="0" w:color="FFFFFF"/>
+              <w:left w:val="none" w:sz="0" w:color="FFFFFF"/>
+              <w:bottom w:val="none" w:sz="0" w:color="FFFFFF"/>
+              <w:right w:val="none" w:sz="0" w:color="FFFFFF"/>
+            </w:tcBorders>
+            <w:tcMar>
+              <w:top w:w="40" w:type="dxa"/>
+              <w:left w:w="90" w:type="dxa"/>
+              <w:bottom w:w="40" w:type="dxa"/>
+              <w:right w:w="90" w:type="dxa"/>
+            </w:tcMar>
+          </w:tcPr>
+          <w:p>
+            <w:pPr>
+              <w:spacing w:before="0" w:after="0" w:line="360" w:lineRule="auto"/>
+              <w:jc w:val="left"/>
+            </w:pPr>
+            <w:r>
+              <w:rPr>
+                <w:b w:val="0"/>
+                <w:sz w:val="18"/>
+              </w:rPr>
+              <w:t>Configurado y compilado</w:t>
             </w:r>
           </w:p>
         </w:tc>
@@ -4582,7 +4582,7 @@
         </w:trPr>
         <w:tc>
           <w:tcPr>
-            <w:tcW w:type="dxa" w:w="1897"/>
+            <w:tcW w:type="dxa" w:w="1886"/>
             <w:tcBorders>
               <w:top w:val="none" w:sz="0" w:color="FFFFFF"/>
               <w:left w:val="none" w:sz="0" w:color="FFFFFF"/>
@@ -4612,7 +4612,7 @@
         </w:tc>
         <w:tc>
           <w:tcPr>
-            <w:tcW w:type="dxa" w:w="1507"/>
+            <w:tcW w:type="dxa" w:w="1504"/>
             <w:tcBorders>
               <w:top w:val="none" w:sz="0" w:color="FFFFFF"/>
               <w:left w:val="none" w:sz="0" w:color="FFFFFF"/>
@@ -4642,7 +4642,7 @@
         </w:tc>
         <w:tc>
           <w:tcPr>
-            <w:tcW w:type="dxa" w:w="4168"/>
+            <w:tcW w:type="dxa" w:w="4157"/>
             <w:tcBorders>
               <w:top w:val="none" w:sz="0" w:color="FFFFFF"/>
               <w:left w:val="none" w:sz="0" w:color="FFFFFF"/>
@@ -4672,7 +4672,7 @@
         </w:tc>
         <w:tc>
           <w:tcPr>
-            <w:tcW w:type="dxa" w:w="1788"/>
+            <w:tcW w:type="dxa" w:w="1813"/>
             <w:tcBorders>
               <w:top w:val="none" w:sz="0" w:color="FFFFFF"/>
               <w:left w:val="none" w:sz="0" w:color="FFFFFF"/>
@@ -4707,7 +4707,7 @@
         </w:trPr>
         <w:tc>
           <w:tcPr>
-            <w:tcW w:type="dxa" w:w="1897"/>
+            <w:tcW w:type="dxa" w:w="1886"/>
             <w:tcBorders>
               <w:top w:val="none" w:sz="0" w:color="FFFFFF"/>
               <w:left w:val="none" w:sz="0" w:color="FFFFFF"/>
@@ -4737,7 +4737,7 @@
         </w:tc>
         <w:tc>
           <w:tcPr>
-            <w:tcW w:type="dxa" w:w="1507"/>
+            <w:tcW w:type="dxa" w:w="1504"/>
             <w:tcBorders>
               <w:top w:val="none" w:sz="0" w:color="FFFFFF"/>
               <w:left w:val="none" w:sz="0" w:color="FFFFFF"/>
@@ -4767,7 +4767,7 @@
         </w:tc>
         <w:tc>
           <w:tcPr>
-            <w:tcW w:type="dxa" w:w="4168"/>
+            <w:tcW w:type="dxa" w:w="4157"/>
             <w:tcBorders>
               <w:top w:val="none" w:sz="0" w:color="FFFFFF"/>
               <w:left w:val="none" w:sz="0" w:color="FFFFFF"/>
@@ -4797,7 +4797,7 @@
         </w:tc>
         <w:tc>
           <w:tcPr>
-            <w:tcW w:type="dxa" w:w="1788"/>
+            <w:tcW w:type="dxa" w:w="1813"/>
             <w:tcBorders>
               <w:top w:val="none" w:sz="0" w:color="FFFFFF"/>
               <w:left w:val="none" w:sz="0" w:color="FFFFFF"/>
@@ -4832,7 +4832,7 @@
         </w:trPr>
         <w:tc>
           <w:tcPr>
-            <w:tcW w:type="dxa" w:w="1897"/>
+            <w:tcW w:type="dxa" w:w="1886"/>
             <w:tcBorders>
               <w:top w:val="none" w:sz="0" w:color="FFFFFF"/>
               <w:left w:val="none" w:sz="0" w:color="FFFFFF"/>
@@ -4862,7 +4862,7 @@
         </w:tc>
         <w:tc>
           <w:tcPr>
-            <w:tcW w:type="dxa" w:w="1507"/>
+            <w:tcW w:type="dxa" w:w="1504"/>
             <w:tcBorders>
               <w:top w:val="none" w:sz="0" w:color="FFFFFF"/>
               <w:left w:val="none" w:sz="0" w:color="FFFFFF"/>
@@ -4892,7 +4892,7 @@
         </w:tc>
         <w:tc>
           <w:tcPr>
-            <w:tcW w:type="dxa" w:w="4168"/>
+            <w:tcW w:type="dxa" w:w="4157"/>
             <w:tcBorders>
               <w:top w:val="none" w:sz="0" w:color="FFFFFF"/>
               <w:left w:val="none" w:sz="0" w:color="FFFFFF"/>
@@ -4922,7 +4922,7 @@
         </w:tc>
         <w:tc>
           <w:tcPr>
-            <w:tcW w:type="dxa" w:w="1788"/>
+            <w:tcW w:type="dxa" w:w="1813"/>
             <w:tcBorders>
               <w:top w:val="none" w:sz="0" w:color="FFFFFF"/>
               <w:left w:val="none" w:sz="0" w:color="FFFFFF"/>
@@ -4957,7 +4957,7 @@
         </w:trPr>
         <w:tc>
           <w:tcPr>
-            <w:tcW w:type="dxa" w:w="1897"/>
+            <w:tcW w:type="dxa" w:w="1886"/>
             <w:tcBorders>
               <w:top w:val="none" w:sz="0" w:color="FFFFFF"/>
               <w:left w:val="none" w:sz="0" w:color="FFFFFF"/>
@@ -4987,7 +4987,7 @@
         </w:tc>
         <w:tc>
           <w:tcPr>
-            <w:tcW w:type="dxa" w:w="1507"/>
+            <w:tcW w:type="dxa" w:w="1504"/>
             <w:tcBorders>
               <w:top w:val="none" w:sz="0" w:color="FFFFFF"/>
               <w:left w:val="none" w:sz="0" w:color="FFFFFF"/>
@@ -5017,7 +5017,7 @@
         </w:tc>
         <w:tc>
           <w:tcPr>
-            <w:tcW w:type="dxa" w:w="4168"/>
+            <w:tcW w:type="dxa" w:w="4157"/>
             <w:tcBorders>
               <w:top w:val="none" w:sz="0" w:color="FFFFFF"/>
               <w:left w:val="none" w:sz="0" w:color="FFFFFF"/>
@@ -5047,31 +5047,31 @@
         </w:tc>
         <w:tc>
           <w:tcPr>
-            <w:tcW w:type="dxa" w:w="1788"/>
-            <w:tcBorders>
-              <w:top w:val="none" w:sz="0" w:color="FFFFFF"/>
-              <w:left w:val="none" w:sz="0" w:color="FFFFFF"/>
-              <w:bottom w:val="none" w:sz="0" w:color="FFFFFF"/>
-              <w:right w:val="none" w:sz="0" w:color="FFFFFF"/>
-            </w:tcBorders>
-            <w:tcMar>
-              <w:top w:w="40" w:type="dxa"/>
-              <w:left w:w="90" w:type="dxa"/>
-              <w:bottom w:w="40" w:type="dxa"/>
-              <w:right w:w="90" w:type="dxa"/>
-            </w:tcMar>
-          </w:tcPr>
-          <w:p>
-            <w:pPr>
-              <w:spacing w:before="0" w:after="0" w:line="360" w:lineRule="auto"/>
-              <w:jc w:val="left"/>
-            </w:pPr>
-            <w:r>
-              <w:rPr>
-                <w:b w:val="0"/>
-                <w:sz w:val="18"/>
-              </w:rPr>
-              <w:t>Corregido</w:t>
+            <w:tcW w:type="dxa" w:w="1813"/>
+            <w:tcBorders>
+              <w:top w:val="none" w:sz="0" w:color="FFFFFF"/>
+              <w:left w:val="none" w:sz="0" w:color="FFFFFF"/>
+              <w:bottom w:val="none" w:sz="0" w:color="FFFFFF"/>
+              <w:right w:val="none" w:sz="0" w:color="FFFFFF"/>
+            </w:tcBorders>
+            <w:tcMar>
+              <w:top w:w="40" w:type="dxa"/>
+              <w:left w:w="90" w:type="dxa"/>
+              <w:bottom w:w="40" w:type="dxa"/>
+              <w:right w:w="90" w:type="dxa"/>
+            </w:tcMar>
+          </w:tcPr>
+          <w:p>
+            <w:pPr>
+              <w:spacing w:before="0" w:after="0" w:line="360" w:lineRule="auto"/>
+              <w:jc w:val="left"/>
+            </w:pPr>
+            <w:r>
+              <w:rPr>
+                <w:b w:val="0"/>
+                <w:sz w:val="18"/>
+              </w:rPr>
+              <w:t>Corregido y compilado</w:t>
             </w:r>
           </w:p>
         </w:tc>
@@ -5082,7 +5082,7 @@
         </w:trPr>
         <w:tc>
           <w:tcPr>
-            <w:tcW w:type="dxa" w:w="1897"/>
+            <w:tcW w:type="dxa" w:w="1886"/>
             <w:tcBorders>
               <w:top w:val="none" w:sz="0" w:color="FFFFFF"/>
               <w:left w:val="none" w:sz="0" w:color="FFFFFF"/>
@@ -5112,7 +5112,7 @@
         </w:tc>
         <w:tc>
           <w:tcPr>
-            <w:tcW w:type="dxa" w:w="1507"/>
+            <w:tcW w:type="dxa" w:w="1504"/>
             <w:tcBorders>
               <w:top w:val="none" w:sz="0" w:color="FFFFFF"/>
               <w:left w:val="none" w:sz="0" w:color="FFFFFF"/>
@@ -5142,7 +5142,7 @@
         </w:tc>
         <w:tc>
           <w:tcPr>
-            <w:tcW w:type="dxa" w:w="4168"/>
+            <w:tcW w:type="dxa" w:w="4157"/>
             <w:tcBorders>
               <w:top w:val="none" w:sz="0" w:color="FFFFFF"/>
               <w:left w:val="none" w:sz="0" w:color="FFFFFF"/>
@@ -5172,7 +5172,7 @@
         </w:tc>
         <w:tc>
           <w:tcPr>
-            <w:tcW w:type="dxa" w:w="1788"/>
+            <w:tcW w:type="dxa" w:w="1813"/>
             <w:tcBorders>
               <w:top w:val="none" w:sz="0" w:color="FFFFFF"/>
               <w:left w:val="none" w:sz="0" w:color="FFFFFF"/>
@@ -5207,7 +5207,7 @@
         </w:trPr>
         <w:tc>
           <w:tcPr>
-            <w:tcW w:type="dxa" w:w="1897"/>
+            <w:tcW w:type="dxa" w:w="1886"/>
             <w:tcBorders>
               <w:top w:val="none" w:sz="0" w:color="FFFFFF"/>
               <w:left w:val="none" w:sz="0" w:color="FFFFFF"/>
@@ -5237,7 +5237,7 @@
         </w:tc>
         <w:tc>
           <w:tcPr>
-            <w:tcW w:type="dxa" w:w="1507"/>
+            <w:tcW w:type="dxa" w:w="1504"/>
             <w:tcBorders>
               <w:top w:val="none" w:sz="0" w:color="FFFFFF"/>
               <w:left w:val="none" w:sz="0" w:color="FFFFFF"/>
@@ -5267,7 +5267,7 @@
         </w:tc>
         <w:tc>
           <w:tcPr>
-            <w:tcW w:type="dxa" w:w="4168"/>
+            <w:tcW w:type="dxa" w:w="4157"/>
             <w:tcBorders>
               <w:top w:val="none" w:sz="0" w:color="FFFFFF"/>
               <w:left w:val="none" w:sz="0" w:color="FFFFFF"/>
@@ -5297,7 +5297,7 @@
         </w:tc>
         <w:tc>
           <w:tcPr>
-            <w:tcW w:type="dxa" w:w="1788"/>
+            <w:tcW w:type="dxa" w:w="1813"/>
             <w:tcBorders>
               <w:top w:val="none" w:sz="0" w:color="FFFFFF"/>
               <w:left w:val="none" w:sz="0" w:color="FFFFFF"/>
@@ -5332,7 +5332,7 @@
         </w:trPr>
         <w:tc>
           <w:tcPr>
-            <w:tcW w:type="dxa" w:w="1897"/>
+            <w:tcW w:type="dxa" w:w="1886"/>
             <w:tcBorders>
               <w:top w:val="none" w:sz="0" w:color="FFFFFF"/>
               <w:left w:val="none" w:sz="0" w:color="FFFFFF"/>
@@ -5362,7 +5362,7 @@
         </w:tc>
         <w:tc>
           <w:tcPr>
-            <w:tcW w:type="dxa" w:w="1507"/>
+            <w:tcW w:type="dxa" w:w="1504"/>
             <w:tcBorders>
               <w:top w:val="none" w:sz="0" w:color="FFFFFF"/>
               <w:left w:val="none" w:sz="0" w:color="FFFFFF"/>
@@ -5392,7 +5392,7 @@
         </w:tc>
         <w:tc>
           <w:tcPr>
-            <w:tcW w:type="dxa" w:w="4168"/>
+            <w:tcW w:type="dxa" w:w="4157"/>
             <w:tcBorders>
               <w:top w:val="none" w:sz="0" w:color="FFFFFF"/>
               <w:left w:val="none" w:sz="0" w:color="FFFFFF"/>
@@ -5422,7 +5422,7 @@
         </w:tc>
         <w:tc>
           <w:tcPr>
-            <w:tcW w:type="dxa" w:w="1788"/>
+            <w:tcW w:type="dxa" w:w="1813"/>
             <w:tcBorders>
               <w:top w:val="none" w:sz="0" w:color="FFFFFF"/>
               <w:left w:val="none" w:sz="0" w:color="FFFFFF"/>
@@ -5457,7 +5457,7 @@
         </w:trPr>
         <w:tc>
           <w:tcPr>
-            <w:tcW w:type="dxa" w:w="1897"/>
+            <w:tcW w:type="dxa" w:w="1886"/>
             <w:tcBorders>
               <w:top w:val="none" w:sz="0" w:color="FFFFFF"/>
               <w:left w:val="none" w:sz="0" w:color="FFFFFF"/>
@@ -5487,7 +5487,7 @@
         </w:tc>
         <w:tc>
           <w:tcPr>
-            <w:tcW w:type="dxa" w:w="1507"/>
+            <w:tcW w:type="dxa" w:w="1504"/>
             <w:tcBorders>
               <w:top w:val="none" w:sz="0" w:color="FFFFFF"/>
               <w:left w:val="none" w:sz="0" w:color="FFFFFF"/>
@@ -5517,7 +5517,7 @@
         </w:tc>
         <w:tc>
           <w:tcPr>
-            <w:tcW w:type="dxa" w:w="4168"/>
+            <w:tcW w:type="dxa" w:w="4157"/>
             <w:tcBorders>
               <w:top w:val="none" w:sz="0" w:color="FFFFFF"/>
               <w:left w:val="none" w:sz="0" w:color="FFFFFF"/>
@@ -5547,7 +5547,7 @@
         </w:tc>
         <w:tc>
           <w:tcPr>
-            <w:tcW w:type="dxa" w:w="1788"/>
+            <w:tcW w:type="dxa" w:w="1813"/>
             <w:tcBorders>
               <w:top w:val="none" w:sz="0" w:color="FFFFFF"/>
               <w:left w:val="none" w:sz="0" w:color="FFFFFF"/>
@@ -5593,7 +5593,7 @@
         <w:rPr>
           <w:sz w:val="24"/>
         </w:rPr>
-        <w:t>MASVS = OWASP Mobile Application Security Verification Standard 2.1.0. Lo configurado en el bloque 3 se aplica al generar el proyecto nativo; falta comprobarlo con una compilación de release (EVD-3-17) y con MobSF en la Fase 4 (EVD-3-07).</w:t>
+        <w:t>MASVS = OWASP Mobile Application Security Verification Standard 2.1.0. Lo configurado en el bloque 3 se aplica al generar el proyecto nativo; el 30 de octubre compilamos la versión de release con esa configuración, se instaló en el emulador y la bienvenida ya muestra el texto corregido (EVD-3-17). El análisis del APK con MobSF queda para la Fase 4 (EVD-3-07).</w:t>
       </w:r>
     </w:p>
     <w:p>

</xml_diff>